<commit_message>
Add Undo Last Added Record using a stack (menu option 14)
A list undo_stack holds the IDs of records added in this session, with
push() and pop() helper functions. Option 14 pops the newest ID, shows
the record and deletes it after confirmation; N pushes it back. Handles
an empty stack and records already deleted with option 5.

README, viva sheet and project report updated (new screenshot, function
list, syllabus concepts and test cases).

Co-Authored-By: Claude Opus 5.5 <noreply@anthropic.com>
Claude-Session: https://claude.ai/code/session_01DGpnhWwohK1ku2D2HQBEpd
</commit_message>
<xml_diff>
--- a/CarbonDataLogger/Project_Report.docx
+++ b/CarbonDataLogger/Project_Report.docx
@@ -1694,7 +1694,7 @@
           <w:sz w:val="24"/>
           <w:szCs w:val="24"/>
         </w:rPr>
-        <w:t xml:space="preserve">The program is controlled from a main menu with 13 options:</w:t>
+        <w:t xml:space="preserve">The program is controlled from a main menu with 14 options:</w:t>
       </w:r>
     </w:p>
     <w:tbl>
@@ -3034,6 +3034,98 @@
                 <w:sz w:val="21"/>
                 <w:szCs w:val="21"/>
               </w:rPr>
+              <w:t xml:space="preserve">14</w:t>
+            </w:r>
+          </w:p>
+        </w:tc>
+        <w:tc>
+          <w:tcPr>
+            <w:tcW w:type="dxa" w:w="3100"/>
+            <w:tcBorders>
+              <w:top w:val="single" w:color="808080" w:sz="4"/>
+              <w:left w:val="single" w:color="808080" w:sz="4"/>
+              <w:bottom w:val="single" w:color="808080" w:sz="4"/>
+              <w:right w:val="single" w:color="808080" w:sz="4"/>
+            </w:tcBorders>
+            <w:tcMar>
+              <w:top w:type="dxa" w:w="60"/>
+              <w:left w:type="dxa" w:w="100"/>
+              <w:bottom w:type="dxa" w:w="60"/>
+              <w:right w:type="dxa" w:w="100"/>
+            </w:tcMar>
+          </w:tcPr>
+          <w:p>
+            <w:r>
+              <w:rPr>
+                <w:rFonts w:ascii="Times New Roman" w:cs="Times New Roman" w:eastAsia="Times New Roman" w:hAnsi="Times New Roman"/>
+                <w:b w:val="false"/>
+                <w:bCs w:val="false"/>
+                <w:sz w:val="21"/>
+                <w:szCs w:val="21"/>
+              </w:rPr>
+              <w:t xml:space="preserve">Undo Last Added Record</w:t>
+            </w:r>
+          </w:p>
+        </w:tc>
+        <w:tc>
+          <w:tcPr>
+            <w:tcW w:type="dxa" w:w="5638"/>
+            <w:tcBorders>
+              <w:top w:val="single" w:color="808080" w:sz="4"/>
+              <w:left w:val="single" w:color="808080" w:sz="4"/>
+              <w:bottom w:val="single" w:color="808080" w:sz="4"/>
+              <w:right w:val="single" w:color="808080" w:sz="4"/>
+            </w:tcBorders>
+            <w:tcMar>
+              <w:top w:type="dxa" w:w="60"/>
+              <w:left w:type="dxa" w:w="100"/>
+              <w:bottom w:type="dxa" w:w="60"/>
+              <w:right w:type="dxa" w:w="100"/>
+            </w:tcMar>
+          </w:tcPr>
+          <w:p>
+            <w:r>
+              <w:rPr>
+                <w:rFonts w:ascii="Times New Roman" w:cs="Times New Roman" w:eastAsia="Times New Roman" w:hAnsi="Times New Roman"/>
+                <w:b w:val="false"/>
+                <w:bCs w:val="false"/>
+                <w:sz w:val="21"/>
+                <w:szCs w:val="21"/>
+              </w:rPr>
+              <w:t xml:space="preserve">Removes the most recently added record of this session, using a stack (Last In, First Out).</w:t>
+            </w:r>
+          </w:p>
+        </w:tc>
+      </w:tr>
+      <w:tr>
+        <w:trPr>
+          <w:tblHeader w:val="false"/>
+        </w:trPr>
+        <w:tc>
+          <w:tcPr>
+            <w:tcW w:type="dxa" w:w="900"/>
+            <w:tcBorders>
+              <w:top w:val="single" w:color="808080" w:sz="4"/>
+              <w:left w:val="single" w:color="808080" w:sz="4"/>
+              <w:bottom w:val="single" w:color="808080" w:sz="4"/>
+              <w:right w:val="single" w:color="808080" w:sz="4"/>
+            </w:tcBorders>
+            <w:tcMar>
+              <w:top w:type="dxa" w:w="60"/>
+              <w:left w:type="dxa" w:w="100"/>
+              <w:bottom w:type="dxa" w:w="60"/>
+              <w:right w:type="dxa" w:w="100"/>
+            </w:tcMar>
+          </w:tcPr>
+          <w:p>
+            <w:r>
+              <w:rPr>
+                <w:rFonts w:ascii="Times New Roman" w:cs="Times New Roman" w:eastAsia="Times New Roman" w:hAnsi="Times New Roman"/>
+                <w:b w:val="false"/>
+                <w:bCs w:val="false"/>
+                <w:sz w:val="21"/>
+                <w:szCs w:val="21"/>
+              </w:rPr>
               <w:t xml:space="preserve">0</w:t>
             </w:r>
           </w:p>
@@ -4450,7 +4542,7 @@
                 <w:sz w:val="21"/>
                 <w:szCs w:val="21"/>
               </w:rPr>
-              <w:t xml:space="preserve">The whole program is divided into 42 small functions, called from main().</w:t>
+              <w:t xml:space="preserve">The whole program is divided into 45 small functions, called from main().</w:t>
             </w:r>
           </w:p>
         </w:tc>
@@ -4577,6 +4669,69 @@
                 <w:szCs w:val="21"/>
               </w:rPr>
               <w:t xml:space="preserve">connect_database() uses the global keyword for connection and cursor.</w:t>
+            </w:r>
+          </w:p>
+        </w:tc>
+      </w:tr>
+      <w:tr>
+        <w:trPr>
+          <w:tblHeader w:val="false"/>
+        </w:trPr>
+        <w:tc>
+          <w:tcPr>
+            <w:tcW w:type="dxa" w:w="3200"/>
+            <w:tcBorders>
+              <w:top w:val="single" w:color="808080" w:sz="4"/>
+              <w:left w:val="single" w:color="808080" w:sz="4"/>
+              <w:bottom w:val="single" w:color="808080" w:sz="4"/>
+              <w:right w:val="single" w:color="808080" w:sz="4"/>
+            </w:tcBorders>
+            <w:tcMar>
+              <w:top w:type="dxa" w:w="60"/>
+              <w:left w:type="dxa" w:w="100"/>
+              <w:bottom w:type="dxa" w:w="60"/>
+              <w:right w:type="dxa" w:w="100"/>
+            </w:tcMar>
+          </w:tcPr>
+          <w:p>
+            <w:r>
+              <w:rPr>
+                <w:rFonts w:ascii="Times New Roman" w:cs="Times New Roman" w:eastAsia="Times New Roman" w:hAnsi="Times New Roman"/>
+                <w:b w:val="false"/>
+                <w:bCs w:val="false"/>
+                <w:sz w:val="21"/>
+                <w:szCs w:val="21"/>
+              </w:rPr>
+              <w:t xml:space="preserve">Stack (data structure)</w:t>
+            </w:r>
+          </w:p>
+        </w:tc>
+        <w:tc>
+          <w:tcPr>
+            <w:tcW w:type="dxa" w:w="6438"/>
+            <w:tcBorders>
+              <w:top w:val="single" w:color="808080" w:sz="4"/>
+              <w:left w:val="single" w:color="808080" w:sz="4"/>
+              <w:bottom w:val="single" w:color="808080" w:sz="4"/>
+              <w:right w:val="single" w:color="808080" w:sz="4"/>
+            </w:tcBorders>
+            <w:tcMar>
+              <w:top w:type="dxa" w:w="60"/>
+              <w:left w:type="dxa" w:w="100"/>
+              <w:bottom w:type="dxa" w:w="60"/>
+              <w:right w:type="dxa" w:w="100"/>
+            </w:tcMar>
+          </w:tcPr>
+          <w:p>
+            <w:r>
+              <w:rPr>
+                <w:rFonts w:ascii="Times New Roman" w:cs="Times New Roman" w:eastAsia="Times New Roman" w:hAnsi="Times New Roman"/>
+                <w:b w:val="false"/>
+                <w:bCs w:val="false"/>
+                <w:sz w:val="21"/>
+                <w:szCs w:val="21"/>
+              </w:rPr>
+              <w:t xml:space="preserve">undo_stack is a list used as a stack, with push() and pop() functions, for Undo Last Added Record.</w:t>
             </w:r>
           </w:p>
         </w:tc>
@@ -9164,7 +9319,7 @@
                 <w:sz w:val="21"/>
                 <w:szCs w:val="21"/>
               </w:rPr>
-              <w:t xml:space="preserve">get_overall_totals()</w:t>
+              <w:t xml:space="preserve">push(stack, item)</w:t>
             </w:r>
           </w:p>
         </w:tc>
@@ -9193,7 +9348,7 @@
                 <w:sz w:val="21"/>
                 <w:szCs w:val="21"/>
               </w:rPr>
-              <w:t xml:space="preserve">Runs COUNT, SUM, AVG, MIN and MAX on all records.</w:t>
+              <w:t xml:space="preserve">Adds an item to the top of the stack.</w:t>
             </w:r>
           </w:p>
         </w:tc>
@@ -9227,7 +9382,7 @@
                 <w:sz w:val="21"/>
                 <w:szCs w:val="21"/>
               </w:rPr>
-              <w:t xml:space="preserve">get_category_totals()</w:t>
+              <w:t xml:space="preserve">pop(stack)</w:t>
             </w:r>
           </w:p>
         </w:tc>
@@ -9256,7 +9411,7 @@
                 <w:sz w:val="21"/>
                 <w:szCs w:val="21"/>
               </w:rPr>
-              <w:t xml:space="preserve">Totals per category with GROUP BY, highest first.</w:t>
+              <w:t xml:space="preserve">Removes and returns the top item, or None if the stack is empty.</w:t>
             </w:r>
           </w:p>
         </w:tc>
@@ -9290,7 +9445,7 @@
                 <w:sz w:val="21"/>
                 <w:szCs w:val="21"/>
               </w:rPr>
-              <w:t xml:space="preserve">get_grand_total(rows)</w:t>
+              <w:t xml:space="preserve">undo_last_record()</w:t>
             </w:r>
           </w:p>
         </w:tc>
@@ -9319,7 +9474,7 @@
                 <w:sz w:val="21"/>
                 <w:szCs w:val="21"/>
               </w:rPr>
-              <w:t xml:space="preserve">Adds the totals of all categories.</w:t>
+              <w:t xml:space="preserve">Pops the newest record ID and deletes that record after confirmation.</w:t>
             </w:r>
           </w:p>
         </w:tc>
@@ -9353,7 +9508,7 @@
                 <w:sz w:val="21"/>
                 <w:szCs w:val="21"/>
               </w:rPr>
-              <w:t xml:space="preserve">overall_summary()</w:t>
+              <w:t xml:space="preserve">get_overall_totals()</w:t>
             </w:r>
           </w:p>
         </w:tc>
@@ -9382,7 +9537,7 @@
                 <w:sz w:val="21"/>
                 <w:szCs w:val="21"/>
               </w:rPr>
-              <w:t xml:space="preserve">Displays the overall summary.</w:t>
+              <w:t xml:space="preserve">Runs COUNT, SUM, AVG, MIN and MAX on all records.</w:t>
             </w:r>
           </w:p>
         </w:tc>
@@ -9416,7 +9571,7 @@
                 <w:sz w:val="21"/>
                 <w:szCs w:val="21"/>
               </w:rPr>
-              <w:t xml:space="preserve">category_summary()</w:t>
+              <w:t xml:space="preserve">get_category_totals()</w:t>
             </w:r>
           </w:p>
         </w:tc>
@@ -9445,7 +9600,7 @@
                 <w:sz w:val="21"/>
                 <w:szCs w:val="21"/>
               </w:rPr>
-              <w:t xml:space="preserve">Displays totals and percentage share by category.</w:t>
+              <w:t xml:space="preserve">Totals per category with GROUP BY, highest first.</w:t>
             </w:r>
           </w:p>
         </w:tc>
@@ -9479,7 +9634,7 @@
                 <w:sz w:val="21"/>
                 <w:szCs w:val="21"/>
               </w:rPr>
-              <w:t xml:space="preserve">show_available_months()</w:t>
+              <w:t xml:space="preserve">get_grand_total(rows)</w:t>
             </w:r>
           </w:p>
         </w:tc>
@@ -9508,7 +9663,7 @@
                 <w:sz w:val="21"/>
                 <w:szCs w:val="21"/>
               </w:rPr>
-              <w:t xml:space="preserve">Lists months with records using DISTINCT.</w:t>
+              <w:t xml:space="preserve">Adds the totals of all categories.</w:t>
             </w:r>
           </w:p>
         </w:tc>
@@ -9542,7 +9697,7 @@
                 <w:sz w:val="21"/>
                 <w:szCs w:val="21"/>
               </w:rPr>
-              <w:t xml:space="preserve">monthly_summary()</w:t>
+              <w:t xml:space="preserve">overall_summary()</w:t>
             </w:r>
           </w:p>
         </w:tc>
@@ -9571,7 +9726,7 @@
                 <w:sz w:val="21"/>
                 <w:szCs w:val="21"/>
               </w:rPr>
-              <w:t xml:space="preserve">Summary for one chosen month.</w:t>
+              <w:t xml:space="preserve">Displays the overall summary.</w:t>
             </w:r>
           </w:p>
         </w:tc>
@@ -9605,7 +9760,7 @@
                 <w:sz w:val="21"/>
                 <w:szCs w:val="21"/>
               </w:rPr>
-              <w:t xml:space="preserve">generate_suggestions(rows)</w:t>
+              <w:t xml:space="preserve">category_summary()</w:t>
             </w:r>
           </w:p>
         </w:tc>
@@ -9634,7 +9789,7 @@
                 <w:sz w:val="21"/>
                 <w:szCs w:val="21"/>
               </w:rPr>
-              <w:t xml:space="preserve">Rule-based tips for categories with 20% or more of total CO2.</w:t>
+              <w:t xml:space="preserve">Displays totals and percentage share by category.</w:t>
             </w:r>
           </w:p>
         </w:tc>
@@ -9668,7 +9823,7 @@
                 <w:sz w:val="21"/>
                 <w:szCs w:val="21"/>
               </w:rPr>
-              <w:t xml:space="preserve">highest_emission_category()</w:t>
+              <w:t xml:space="preserve">show_available_months()</w:t>
             </w:r>
           </w:p>
         </w:tc>
@@ -9697,7 +9852,7 @@
                 <w:sz w:val="21"/>
                 <w:szCs w:val="21"/>
               </w:rPr>
-              <w:t xml:space="preserve">Shows the highest and lowest categories and suggestions.</w:t>
+              <w:t xml:space="preserve">Lists months with records using DISTINCT.</w:t>
             </w:r>
           </w:p>
         </w:tc>
@@ -9731,7 +9886,7 @@
                 <w:sz w:val="21"/>
                 <w:szCs w:val="21"/>
               </w:rPr>
-              <w:t xml:space="preserve">export_to_csv()</w:t>
+              <w:t xml:space="preserve">monthly_summary()</w:t>
             </w:r>
           </w:p>
         </w:tc>
@@ -9760,7 +9915,7 @@
                 <w:sz w:val="21"/>
                 <w:szCs w:val="21"/>
               </w:rPr>
-              <w:t xml:space="preserve">Writes all records to carbon_records.csv.</w:t>
+              <w:t xml:space="preserve">Summary for one chosen month.</w:t>
             </w:r>
           </w:p>
         </w:tc>
@@ -9794,7 +9949,7 @@
                 <w:sz w:val="21"/>
                 <w:szCs w:val="21"/>
               </w:rPr>
-              <w:t xml:space="preserve">export_summary_to_text()</w:t>
+              <w:t xml:space="preserve">generate_suggestions(rows)</w:t>
             </w:r>
           </w:p>
         </w:tc>
@@ -9823,7 +9978,7 @@
                 <w:sz w:val="21"/>
                 <w:szCs w:val="21"/>
               </w:rPr>
-              <w:t xml:space="preserve">Writes a summary report to carbon_summary.txt.</w:t>
+              <w:t xml:space="preserve">Rule-based tips for categories with 20% or more of total CO2.</w:t>
             </w:r>
           </w:p>
         </w:tc>
@@ -9857,7 +10012,7 @@
                 <w:sz w:val="21"/>
                 <w:szCs w:val="21"/>
               </w:rPr>
-              <w:t xml:space="preserve">update_emission_factor()</w:t>
+              <w:t xml:space="preserve">highest_emission_category()</w:t>
             </w:r>
           </w:p>
         </w:tc>
@@ -9886,7 +10041,7 @@
                 <w:sz w:val="21"/>
                 <w:szCs w:val="21"/>
               </w:rPr>
-              <w:t xml:space="preserve">Changes the factor of a category.</w:t>
+              <w:t xml:space="preserve">Shows the highest and lowest categories and suggestions.</w:t>
             </w:r>
           </w:p>
         </w:tc>
@@ -9920,7 +10075,7 @@
                 <w:sz w:val="21"/>
                 <w:szCs w:val="21"/>
               </w:rPr>
-              <w:t xml:space="preserve">add_category()</w:t>
+              <w:t xml:space="preserve">export_to_csv()</w:t>
             </w:r>
           </w:p>
         </w:tc>
@@ -9949,7 +10104,7 @@
                 <w:sz w:val="21"/>
                 <w:szCs w:val="21"/>
               </w:rPr>
-              <w:t xml:space="preserve">Adds a new category with checks for length and duplicates.</w:t>
+              <w:t xml:space="preserve">Writes all records to carbon_records.csv.</w:t>
             </w:r>
           </w:p>
         </w:tc>
@@ -9983,7 +10138,7 @@
                 <w:sz w:val="21"/>
                 <w:szCs w:val="21"/>
               </w:rPr>
-              <w:t xml:space="preserve">manage_emission_factors()</w:t>
+              <w:t xml:space="preserve">export_summary_to_text()</w:t>
             </w:r>
           </w:p>
         </w:tc>
@@ -10012,7 +10167,7 @@
                 <w:sz w:val="21"/>
                 <w:szCs w:val="21"/>
               </w:rPr>
-              <w:t xml:space="preserve">Sub-menu for viewing and managing factors.</w:t>
+              <w:t xml:space="preserve">Writes a summary report to carbon_summary.txt.</w:t>
             </w:r>
           </w:p>
         </w:tc>
@@ -10046,7 +10201,7 @@
                 <w:sz w:val="21"/>
                 <w:szCs w:val="21"/>
               </w:rPr>
-              <w:t xml:space="preserve">show_help()</w:t>
+              <w:t xml:space="preserve">update_emission_factor()</w:t>
             </w:r>
           </w:p>
         </w:tc>
@@ -10075,7 +10230,7 @@
                 <w:sz w:val="21"/>
                 <w:szCs w:val="21"/>
               </w:rPr>
-              <w:t xml:space="preserve">Displays help text.</w:t>
+              <w:t xml:space="preserve">Changes the factor of a category.</w:t>
             </w:r>
           </w:p>
         </w:tc>
@@ -10109,7 +10264,7 @@
                 <w:sz w:val="21"/>
                 <w:szCs w:val="21"/>
               </w:rPr>
-              <w:t xml:space="preserve">display_main_menu()</w:t>
+              <w:t xml:space="preserve">add_category()</w:t>
             </w:r>
           </w:p>
         </w:tc>
@@ -10138,7 +10293,7 @@
                 <w:sz w:val="21"/>
                 <w:szCs w:val="21"/>
               </w:rPr>
-              <w:t xml:space="preserve">Prints the main menu.</w:t>
+              <w:t xml:space="preserve">Adds a new category with checks for length and duplicates.</w:t>
             </w:r>
           </w:p>
         </w:tc>
@@ -10172,6 +10327,195 @@
                 <w:sz w:val="21"/>
                 <w:szCs w:val="21"/>
               </w:rPr>
+              <w:t xml:space="preserve">manage_emission_factors()</w:t>
+            </w:r>
+          </w:p>
+        </w:tc>
+        <w:tc>
+          <w:tcPr>
+            <w:tcW w:type="dxa" w:w="6338"/>
+            <w:tcBorders>
+              <w:top w:val="single" w:color="808080" w:sz="4"/>
+              <w:left w:val="single" w:color="808080" w:sz="4"/>
+              <w:bottom w:val="single" w:color="808080" w:sz="4"/>
+              <w:right w:val="single" w:color="808080" w:sz="4"/>
+            </w:tcBorders>
+            <w:tcMar>
+              <w:top w:type="dxa" w:w="60"/>
+              <w:left w:type="dxa" w:w="100"/>
+              <w:bottom w:type="dxa" w:w="60"/>
+              <w:right w:type="dxa" w:w="100"/>
+            </w:tcMar>
+          </w:tcPr>
+          <w:p>
+            <w:r>
+              <w:rPr>
+                <w:rFonts w:ascii="Times New Roman" w:cs="Times New Roman" w:eastAsia="Times New Roman" w:hAnsi="Times New Roman"/>
+                <w:b w:val="false"/>
+                <w:bCs w:val="false"/>
+                <w:sz w:val="21"/>
+                <w:szCs w:val="21"/>
+              </w:rPr>
+              <w:t xml:space="preserve">Sub-menu for viewing and managing factors.</w:t>
+            </w:r>
+          </w:p>
+        </w:tc>
+      </w:tr>
+      <w:tr>
+        <w:trPr>
+          <w:tblHeader w:val="false"/>
+        </w:trPr>
+        <w:tc>
+          <w:tcPr>
+            <w:tcW w:type="dxa" w:w="3300"/>
+            <w:tcBorders>
+              <w:top w:val="single" w:color="808080" w:sz="4"/>
+              <w:left w:val="single" w:color="808080" w:sz="4"/>
+              <w:bottom w:val="single" w:color="808080" w:sz="4"/>
+              <w:right w:val="single" w:color="808080" w:sz="4"/>
+            </w:tcBorders>
+            <w:tcMar>
+              <w:top w:type="dxa" w:w="60"/>
+              <w:left w:type="dxa" w:w="100"/>
+              <w:bottom w:type="dxa" w:w="60"/>
+              <w:right w:type="dxa" w:w="100"/>
+            </w:tcMar>
+          </w:tcPr>
+          <w:p>
+            <w:r>
+              <w:rPr>
+                <w:rFonts w:ascii="Courier New" w:cs="Courier New" w:eastAsia="Courier New" w:hAnsi="Courier New"/>
+                <w:b w:val="false"/>
+                <w:bCs w:val="false"/>
+                <w:sz w:val="21"/>
+                <w:szCs w:val="21"/>
+              </w:rPr>
+              <w:t xml:space="preserve">show_help()</w:t>
+            </w:r>
+          </w:p>
+        </w:tc>
+        <w:tc>
+          <w:tcPr>
+            <w:tcW w:type="dxa" w:w="6338"/>
+            <w:tcBorders>
+              <w:top w:val="single" w:color="808080" w:sz="4"/>
+              <w:left w:val="single" w:color="808080" w:sz="4"/>
+              <w:bottom w:val="single" w:color="808080" w:sz="4"/>
+              <w:right w:val="single" w:color="808080" w:sz="4"/>
+            </w:tcBorders>
+            <w:tcMar>
+              <w:top w:type="dxa" w:w="60"/>
+              <w:left w:type="dxa" w:w="100"/>
+              <w:bottom w:type="dxa" w:w="60"/>
+              <w:right w:type="dxa" w:w="100"/>
+            </w:tcMar>
+          </w:tcPr>
+          <w:p>
+            <w:r>
+              <w:rPr>
+                <w:rFonts w:ascii="Times New Roman" w:cs="Times New Roman" w:eastAsia="Times New Roman" w:hAnsi="Times New Roman"/>
+                <w:b w:val="false"/>
+                <w:bCs w:val="false"/>
+                <w:sz w:val="21"/>
+                <w:szCs w:val="21"/>
+              </w:rPr>
+              <w:t xml:space="preserve">Displays help text.</w:t>
+            </w:r>
+          </w:p>
+        </w:tc>
+      </w:tr>
+      <w:tr>
+        <w:trPr>
+          <w:tblHeader w:val="false"/>
+        </w:trPr>
+        <w:tc>
+          <w:tcPr>
+            <w:tcW w:type="dxa" w:w="3300"/>
+            <w:tcBorders>
+              <w:top w:val="single" w:color="808080" w:sz="4"/>
+              <w:left w:val="single" w:color="808080" w:sz="4"/>
+              <w:bottom w:val="single" w:color="808080" w:sz="4"/>
+              <w:right w:val="single" w:color="808080" w:sz="4"/>
+            </w:tcBorders>
+            <w:tcMar>
+              <w:top w:type="dxa" w:w="60"/>
+              <w:left w:type="dxa" w:w="100"/>
+              <w:bottom w:type="dxa" w:w="60"/>
+              <w:right w:type="dxa" w:w="100"/>
+            </w:tcMar>
+          </w:tcPr>
+          <w:p>
+            <w:r>
+              <w:rPr>
+                <w:rFonts w:ascii="Courier New" w:cs="Courier New" w:eastAsia="Courier New" w:hAnsi="Courier New"/>
+                <w:b w:val="false"/>
+                <w:bCs w:val="false"/>
+                <w:sz w:val="21"/>
+                <w:szCs w:val="21"/>
+              </w:rPr>
+              <w:t xml:space="preserve">display_main_menu()</w:t>
+            </w:r>
+          </w:p>
+        </w:tc>
+        <w:tc>
+          <w:tcPr>
+            <w:tcW w:type="dxa" w:w="6338"/>
+            <w:tcBorders>
+              <w:top w:val="single" w:color="808080" w:sz="4"/>
+              <w:left w:val="single" w:color="808080" w:sz="4"/>
+              <w:bottom w:val="single" w:color="808080" w:sz="4"/>
+              <w:right w:val="single" w:color="808080" w:sz="4"/>
+            </w:tcBorders>
+            <w:tcMar>
+              <w:top w:type="dxa" w:w="60"/>
+              <w:left w:type="dxa" w:w="100"/>
+              <w:bottom w:type="dxa" w:w="60"/>
+              <w:right w:type="dxa" w:w="100"/>
+            </w:tcMar>
+          </w:tcPr>
+          <w:p>
+            <w:r>
+              <w:rPr>
+                <w:rFonts w:ascii="Times New Roman" w:cs="Times New Roman" w:eastAsia="Times New Roman" w:hAnsi="Times New Roman"/>
+                <w:b w:val="false"/>
+                <w:bCs w:val="false"/>
+                <w:sz w:val="21"/>
+                <w:szCs w:val="21"/>
+              </w:rPr>
+              <w:t xml:space="preserve">Prints the main menu.</w:t>
+            </w:r>
+          </w:p>
+        </w:tc>
+      </w:tr>
+      <w:tr>
+        <w:trPr>
+          <w:tblHeader w:val="false"/>
+        </w:trPr>
+        <w:tc>
+          <w:tcPr>
+            <w:tcW w:type="dxa" w:w="3300"/>
+            <w:tcBorders>
+              <w:top w:val="single" w:color="808080" w:sz="4"/>
+              <w:left w:val="single" w:color="808080" w:sz="4"/>
+              <w:bottom w:val="single" w:color="808080" w:sz="4"/>
+              <w:right w:val="single" w:color="808080" w:sz="4"/>
+            </w:tcBorders>
+            <w:tcMar>
+              <w:top w:type="dxa" w:w="60"/>
+              <w:left w:type="dxa" w:w="100"/>
+              <w:bottom w:type="dxa" w:w="60"/>
+              <w:right w:type="dxa" w:w="100"/>
+            </w:tcMar>
+          </w:tcPr>
+          <w:p>
+            <w:r>
+              <w:rPr>
+                <w:rFonts w:ascii="Courier New" w:cs="Courier New" w:eastAsia="Courier New" w:hAnsi="Courier New"/>
+                <w:b w:val="false"/>
+                <w:bCs w:val="false"/>
+                <w:sz w:val="21"/>
+                <w:szCs w:val="21"/>
+              </w:rPr>
               <w:t xml:space="preserve">main()</w:t>
             </w:r>
           </w:p>
@@ -11716,6 +12060,32 @@
           <w:sz w:val="16"/>
           <w:szCs w:val="16"/>
         </w:rPr>
+        <w:t xml:space="preserve"># Stack of record IDs added in this session, used by "Undo Last Added Record"</w:t>
+      </w:r>
+    </w:p>
+    <w:p>
+      <w:pPr>
+        <w:spacing w:after="0" w:line="228"/>
+      </w:pPr>
+      <w:r>
+        <w:rPr>
+          <w:rFonts w:ascii="Courier New" w:cs="Courier New" w:eastAsia="Courier New" w:hAnsi="Courier New"/>
+          <w:sz w:val="16"/>
+          <w:szCs w:val="16"/>
+        </w:rPr>
+        <w:t xml:space="preserve">undo_stack = []</w:t>
+      </w:r>
+    </w:p>
+    <w:p>
+      <w:pPr>
+        <w:spacing w:after="0" w:line="228"/>
+      </w:pPr>
+      <w:r>
+        <w:rPr>
+          <w:rFonts w:ascii="Courier New" w:cs="Courier New" w:eastAsia="Courier New" w:hAnsi="Courier New"/>
+          <w:sz w:val="16"/>
+          <w:szCs w:val="16"/>
+        </w:rPr>
         <w:t xml:space="preserve"> </w:t>
       </w:r>
     </w:p>
@@ -11729,6 +12099,19 @@
           <w:sz w:val="16"/>
           <w:szCs w:val="16"/>
         </w:rPr>
+        <w:t xml:space="preserve"> </w:t>
+      </w:r>
+    </w:p>
+    <w:p>
+      <w:pPr>
+        <w:spacing w:after="0" w:line="228"/>
+      </w:pPr>
+      <w:r>
+        <w:rPr>
+          <w:rFonts w:ascii="Courier New" w:cs="Courier New" w:eastAsia="Courier New" w:hAnsi="Courier New"/>
+          <w:sz w:val="16"/>
+          <w:szCs w:val="16"/>
+        </w:rPr>
         <w:t xml:space="preserve"># ---------------- Database setup ----------------</w:t>
       </w:r>
     </w:p>
@@ -13887,6 +14270,32 @@
           <w:sz w:val="16"/>
           <w:szCs w:val="16"/>
         </w:rPr>
+        <w:t xml:space="preserve">        # Remember the new record so that it can be undone later</w:t>
+      </w:r>
+    </w:p>
+    <w:p>
+      <w:pPr>
+        <w:spacing w:after="0" w:line="228"/>
+      </w:pPr>
+      <w:r>
+        <w:rPr>
+          <w:rFonts w:ascii="Courier New" w:cs="Courier New" w:eastAsia="Courier New" w:hAnsi="Courier New"/>
+          <w:sz w:val="16"/>
+          <w:szCs w:val="16"/>
+        </w:rPr>
+        <w:t xml:space="preserve">        push(undo_stack, cursor.lastrowid)</w:t>
+      </w:r>
+    </w:p>
+    <w:p>
+      <w:pPr>
+        <w:spacing w:after="0" w:line="228"/>
+      </w:pPr>
+      <w:r>
+        <w:rPr>
+          <w:rFonts w:ascii="Courier New" w:cs="Courier New" w:eastAsia="Courier New" w:hAnsi="Courier New"/>
+          <w:sz w:val="16"/>
+          <w:szCs w:val="16"/>
+        </w:rPr>
         <w:t xml:space="preserve">    else:</w:t>
       </w:r>
     </w:p>
@@ -16058,6 +16467,474 @@
           <w:sz w:val="16"/>
           <w:szCs w:val="16"/>
         </w:rPr>
+        <w:t xml:space="preserve"># ---------------- Undo using a stack ----------------</w:t>
+      </w:r>
+    </w:p>
+    <w:p>
+      <w:pPr>
+        <w:spacing w:after="0" w:line="228"/>
+      </w:pPr>
+      <w:r>
+        <w:rPr>
+          <w:rFonts w:ascii="Courier New" w:cs="Courier New" w:eastAsia="Courier New" w:hAnsi="Courier New"/>
+          <w:sz w:val="16"/>
+          <w:szCs w:val="16"/>
+        </w:rPr>
+        <w:t xml:space="preserve"> </w:t>
+      </w:r>
+    </w:p>
+    <w:p>
+      <w:pPr>
+        <w:spacing w:after="0" w:line="228"/>
+      </w:pPr>
+      <w:r>
+        <w:rPr>
+          <w:rFonts w:ascii="Courier New" w:cs="Courier New" w:eastAsia="Courier New" w:hAnsi="Courier New"/>
+          <w:sz w:val="16"/>
+          <w:szCs w:val="16"/>
+        </w:rPr>
+        <w:t xml:space="preserve"># Add an item to the top of the stack</w:t>
+      </w:r>
+    </w:p>
+    <w:p>
+      <w:pPr>
+        <w:spacing w:after="0" w:line="228"/>
+      </w:pPr>
+      <w:r>
+        <w:rPr>
+          <w:rFonts w:ascii="Courier New" w:cs="Courier New" w:eastAsia="Courier New" w:hAnsi="Courier New"/>
+          <w:sz w:val="16"/>
+          <w:szCs w:val="16"/>
+        </w:rPr>
+        <w:t xml:space="preserve">def push(stack, item):</w:t>
+      </w:r>
+    </w:p>
+    <w:p>
+      <w:pPr>
+        <w:spacing w:after="0" w:line="228"/>
+      </w:pPr>
+      <w:r>
+        <w:rPr>
+          <w:rFonts w:ascii="Courier New" w:cs="Courier New" w:eastAsia="Courier New" w:hAnsi="Courier New"/>
+          <w:sz w:val="16"/>
+          <w:szCs w:val="16"/>
+        </w:rPr>
+        <w:t xml:space="preserve">    stack.append(item)</w:t>
+      </w:r>
+    </w:p>
+    <w:p>
+      <w:pPr>
+        <w:spacing w:after="0" w:line="228"/>
+      </w:pPr>
+      <w:r>
+        <w:rPr>
+          <w:rFonts w:ascii="Courier New" w:cs="Courier New" w:eastAsia="Courier New" w:hAnsi="Courier New"/>
+          <w:sz w:val="16"/>
+          <w:szCs w:val="16"/>
+        </w:rPr>
+        <w:t xml:space="preserve"> </w:t>
+      </w:r>
+    </w:p>
+    <w:p>
+      <w:pPr>
+        <w:spacing w:after="0" w:line="228"/>
+      </w:pPr>
+      <w:r>
+        <w:rPr>
+          <w:rFonts w:ascii="Courier New" w:cs="Courier New" w:eastAsia="Courier New" w:hAnsi="Courier New"/>
+          <w:sz w:val="16"/>
+          <w:szCs w:val="16"/>
+        </w:rPr>
+        <w:t xml:space="preserve"> </w:t>
+      </w:r>
+    </w:p>
+    <w:p>
+      <w:pPr>
+        <w:spacing w:after="0" w:line="228"/>
+      </w:pPr>
+      <w:r>
+        <w:rPr>
+          <w:rFonts w:ascii="Courier New" w:cs="Courier New" w:eastAsia="Courier New" w:hAnsi="Courier New"/>
+          <w:sz w:val="16"/>
+          <w:szCs w:val="16"/>
+        </w:rPr>
+        <w:t xml:space="preserve"># Remove and return the top item of the stack, or None if it is empty</w:t>
+      </w:r>
+    </w:p>
+    <w:p>
+      <w:pPr>
+        <w:spacing w:after="0" w:line="228"/>
+      </w:pPr>
+      <w:r>
+        <w:rPr>
+          <w:rFonts w:ascii="Courier New" w:cs="Courier New" w:eastAsia="Courier New" w:hAnsi="Courier New"/>
+          <w:sz w:val="16"/>
+          <w:szCs w:val="16"/>
+        </w:rPr>
+        <w:t xml:space="preserve">def pop(stack):</w:t>
+      </w:r>
+    </w:p>
+    <w:p>
+      <w:pPr>
+        <w:spacing w:after="0" w:line="228"/>
+      </w:pPr>
+      <w:r>
+        <w:rPr>
+          <w:rFonts w:ascii="Courier New" w:cs="Courier New" w:eastAsia="Courier New" w:hAnsi="Courier New"/>
+          <w:sz w:val="16"/>
+          <w:szCs w:val="16"/>
+        </w:rPr>
+        <w:t xml:space="preserve">    if len(stack) == 0:</w:t>
+      </w:r>
+    </w:p>
+    <w:p>
+      <w:pPr>
+        <w:spacing w:after="0" w:line="228"/>
+      </w:pPr>
+      <w:r>
+        <w:rPr>
+          <w:rFonts w:ascii="Courier New" w:cs="Courier New" w:eastAsia="Courier New" w:hAnsi="Courier New"/>
+          <w:sz w:val="16"/>
+          <w:szCs w:val="16"/>
+        </w:rPr>
+        <w:t xml:space="preserve">        return None</w:t>
+      </w:r>
+    </w:p>
+    <w:p>
+      <w:pPr>
+        <w:spacing w:after="0" w:line="228"/>
+      </w:pPr>
+      <w:r>
+        <w:rPr>
+          <w:rFonts w:ascii="Courier New" w:cs="Courier New" w:eastAsia="Courier New" w:hAnsi="Courier New"/>
+          <w:sz w:val="16"/>
+          <w:szCs w:val="16"/>
+        </w:rPr>
+        <w:t xml:space="preserve">    return stack.pop()</w:t>
+      </w:r>
+    </w:p>
+    <w:p>
+      <w:pPr>
+        <w:spacing w:after="0" w:line="228"/>
+      </w:pPr>
+      <w:r>
+        <w:rPr>
+          <w:rFonts w:ascii="Courier New" w:cs="Courier New" w:eastAsia="Courier New" w:hAnsi="Courier New"/>
+          <w:sz w:val="16"/>
+          <w:szCs w:val="16"/>
+        </w:rPr>
+        <w:t xml:space="preserve"> </w:t>
+      </w:r>
+    </w:p>
+    <w:p>
+      <w:pPr>
+        <w:spacing w:after="0" w:line="228"/>
+      </w:pPr>
+      <w:r>
+        <w:rPr>
+          <w:rFonts w:ascii="Courier New" w:cs="Courier New" w:eastAsia="Courier New" w:hAnsi="Courier New"/>
+          <w:sz w:val="16"/>
+          <w:szCs w:val="16"/>
+        </w:rPr>
+        <w:t xml:space="preserve"> </w:t>
+      </w:r>
+    </w:p>
+    <w:p>
+      <w:pPr>
+        <w:spacing w:after="0" w:line="228"/>
+      </w:pPr>
+      <w:r>
+        <w:rPr>
+          <w:rFonts w:ascii="Courier New" w:cs="Courier New" w:eastAsia="Courier New" w:hAnsi="Courier New"/>
+          <w:sz w:val="16"/>
+          <w:szCs w:val="16"/>
+        </w:rPr>
+        <w:t xml:space="preserve"># Remove the most recently added record (Last In, First Out)</w:t>
+      </w:r>
+    </w:p>
+    <w:p>
+      <w:pPr>
+        <w:spacing w:after="0" w:line="228"/>
+      </w:pPr>
+      <w:r>
+        <w:rPr>
+          <w:rFonts w:ascii="Courier New" w:cs="Courier New" w:eastAsia="Courier New" w:hAnsi="Courier New"/>
+          <w:sz w:val="16"/>
+          <w:szCs w:val="16"/>
+        </w:rPr>
+        <w:t xml:space="preserve">def undo_last_record():</w:t>
+      </w:r>
+    </w:p>
+    <w:p>
+      <w:pPr>
+        <w:spacing w:after="0" w:line="228"/>
+      </w:pPr>
+      <w:r>
+        <w:rPr>
+          <w:rFonts w:ascii="Courier New" w:cs="Courier New" w:eastAsia="Courier New" w:hAnsi="Courier New"/>
+          <w:sz w:val="16"/>
+          <w:szCs w:val="16"/>
+        </w:rPr>
+        <w:t xml:space="preserve">    print_heading("UNDO LAST ADDED RECORD")</w:t>
+      </w:r>
+    </w:p>
+    <w:p>
+      <w:pPr>
+        <w:spacing w:after="0" w:line="228"/>
+      </w:pPr>
+      <w:r>
+        <w:rPr>
+          <w:rFonts w:ascii="Courier New" w:cs="Courier New" w:eastAsia="Courier New" w:hAnsi="Courier New"/>
+          <w:sz w:val="16"/>
+          <w:szCs w:val="16"/>
+        </w:rPr>
+        <w:t xml:space="preserve">    record_id = pop(undo_stack)</w:t>
+      </w:r>
+    </w:p>
+    <w:p>
+      <w:pPr>
+        <w:spacing w:after="0" w:line="228"/>
+      </w:pPr>
+      <w:r>
+        <w:rPr>
+          <w:rFonts w:ascii="Courier New" w:cs="Courier New" w:eastAsia="Courier New" w:hAnsi="Courier New"/>
+          <w:sz w:val="16"/>
+          <w:szCs w:val="16"/>
+        </w:rPr>
+        <w:t xml:space="preserve">    if record_id is None:</w:t>
+      </w:r>
+    </w:p>
+    <w:p>
+      <w:pPr>
+        <w:spacing w:after="0" w:line="228"/>
+      </w:pPr>
+      <w:r>
+        <w:rPr>
+          <w:rFonts w:ascii="Courier New" w:cs="Courier New" w:eastAsia="Courier New" w:hAnsi="Courier New"/>
+          <w:sz w:val="16"/>
+          <w:szCs w:val="16"/>
+        </w:rPr>
+        <w:t xml:space="preserve">        print("Nothing to undo. No records have been added in this session.")</w:t>
+      </w:r>
+    </w:p>
+    <w:p>
+      <w:pPr>
+        <w:spacing w:after="0" w:line="228"/>
+      </w:pPr>
+      <w:r>
+        <w:rPr>
+          <w:rFonts w:ascii="Courier New" w:cs="Courier New" w:eastAsia="Courier New" w:hAnsi="Courier New"/>
+          <w:sz w:val="16"/>
+          <w:szCs w:val="16"/>
+        </w:rPr>
+        <w:t xml:space="preserve">        return</w:t>
+      </w:r>
+    </w:p>
+    <w:p>
+      <w:pPr>
+        <w:spacing w:after="0" w:line="228"/>
+      </w:pPr>
+      <w:r>
+        <w:rPr>
+          <w:rFonts w:ascii="Courier New" w:cs="Courier New" w:eastAsia="Courier New" w:hAnsi="Courier New"/>
+          <w:sz w:val="16"/>
+          <w:szCs w:val="16"/>
+        </w:rPr>
+        <w:t xml:space="preserve">    record = get_record(record_id)</w:t>
+      </w:r>
+    </w:p>
+    <w:p>
+      <w:pPr>
+        <w:spacing w:after="0" w:line="228"/>
+      </w:pPr>
+      <w:r>
+        <w:rPr>
+          <w:rFonts w:ascii="Courier New" w:cs="Courier New" w:eastAsia="Courier New" w:hAnsi="Courier New"/>
+          <w:sz w:val="16"/>
+          <w:szCs w:val="16"/>
+        </w:rPr>
+        <w:t xml:space="preserve">    if record is None:</w:t>
+      </w:r>
+    </w:p>
+    <w:p>
+      <w:pPr>
+        <w:spacing w:after="0" w:line="228"/>
+      </w:pPr>
+      <w:r>
+        <w:rPr>
+          <w:rFonts w:ascii="Courier New" w:cs="Courier New" w:eastAsia="Courier New" w:hAnsi="Courier New"/>
+          <w:sz w:val="16"/>
+          <w:szCs w:val="16"/>
+        </w:rPr>
+        <w:t xml:space="preserve">        print("Record", record_id, "was already deleted.")</w:t>
+      </w:r>
+    </w:p>
+    <w:p>
+      <w:pPr>
+        <w:spacing w:after="0" w:line="228"/>
+      </w:pPr>
+      <w:r>
+        <w:rPr>
+          <w:rFonts w:ascii="Courier New" w:cs="Courier New" w:eastAsia="Courier New" w:hAnsi="Courier New"/>
+          <w:sz w:val="16"/>
+          <w:szCs w:val="16"/>
+        </w:rPr>
+        <w:t xml:space="preserve">        return</w:t>
+      </w:r>
+    </w:p>
+    <w:p>
+      <w:pPr>
+        <w:spacing w:after="0" w:line="228"/>
+      </w:pPr>
+      <w:r>
+        <w:rPr>
+          <w:rFonts w:ascii="Courier New" w:cs="Courier New" w:eastAsia="Courier New" w:hAnsi="Courier New"/>
+          <w:sz w:val="16"/>
+          <w:szCs w:val="16"/>
+        </w:rPr>
+        <w:t xml:space="preserve">    print_records([record])</w:t>
+      </w:r>
+    </w:p>
+    <w:p>
+      <w:pPr>
+        <w:spacing w:after="0" w:line="228"/>
+      </w:pPr>
+      <w:r>
+        <w:rPr>
+          <w:rFonts w:ascii="Courier New" w:cs="Courier New" w:eastAsia="Courier New" w:hAnsi="Courier New"/>
+          <w:sz w:val="16"/>
+          <w:szCs w:val="16"/>
+        </w:rPr>
+        <w:t xml:space="preserve">    if ask_yes_no("Remove this record?"):</w:t>
+      </w:r>
+    </w:p>
+    <w:p>
+      <w:pPr>
+        <w:spacing w:after="0" w:line="228"/>
+      </w:pPr>
+      <w:r>
+        <w:rPr>
+          <w:rFonts w:ascii="Courier New" w:cs="Courier New" w:eastAsia="Courier New" w:hAnsi="Courier New"/>
+          <w:sz w:val="16"/>
+          <w:szCs w:val="16"/>
+        </w:rPr>
+        <w:t xml:space="preserve">        cursor.execute("DELETE FROM emission_records WHERE record_id = %s", (record_id,))</w:t>
+      </w:r>
+    </w:p>
+    <w:p>
+      <w:pPr>
+        <w:spacing w:after="0" w:line="228"/>
+      </w:pPr>
+      <w:r>
+        <w:rPr>
+          <w:rFonts w:ascii="Courier New" w:cs="Courier New" w:eastAsia="Courier New" w:hAnsi="Courier New"/>
+          <w:sz w:val="16"/>
+          <w:szCs w:val="16"/>
+        </w:rPr>
+        <w:t xml:space="preserve">        connection.commit()</w:t>
+      </w:r>
+    </w:p>
+    <w:p>
+      <w:pPr>
+        <w:spacing w:after="0" w:line="228"/>
+      </w:pPr>
+      <w:r>
+        <w:rPr>
+          <w:rFonts w:ascii="Courier New" w:cs="Courier New" w:eastAsia="Courier New" w:hAnsi="Courier New"/>
+          <w:sz w:val="16"/>
+          <w:szCs w:val="16"/>
+        </w:rPr>
+        <w:t xml:space="preserve">        print("Record removed.", len(undo_stack), "more record(s) can be undone.")</w:t>
+      </w:r>
+    </w:p>
+    <w:p>
+      <w:pPr>
+        <w:spacing w:after="0" w:line="228"/>
+      </w:pPr>
+      <w:r>
+        <w:rPr>
+          <w:rFonts w:ascii="Courier New" w:cs="Courier New" w:eastAsia="Courier New" w:hAnsi="Courier New"/>
+          <w:sz w:val="16"/>
+          <w:szCs w:val="16"/>
+        </w:rPr>
+        <w:t xml:space="preserve">    else:</w:t>
+      </w:r>
+    </w:p>
+    <w:p>
+      <w:pPr>
+        <w:spacing w:after="0" w:line="228"/>
+      </w:pPr>
+      <w:r>
+        <w:rPr>
+          <w:rFonts w:ascii="Courier New" w:cs="Courier New" w:eastAsia="Courier New" w:hAnsi="Courier New"/>
+          <w:sz w:val="16"/>
+          <w:szCs w:val="16"/>
+        </w:rPr>
+        <w:t xml:space="preserve">        # Put the ID back so the user can undo it later</w:t>
+      </w:r>
+    </w:p>
+    <w:p>
+      <w:pPr>
+        <w:spacing w:after="0" w:line="228"/>
+      </w:pPr>
+      <w:r>
+        <w:rPr>
+          <w:rFonts w:ascii="Courier New" w:cs="Courier New" w:eastAsia="Courier New" w:hAnsi="Courier New"/>
+          <w:sz w:val="16"/>
+          <w:szCs w:val="16"/>
+        </w:rPr>
+        <w:t xml:space="preserve">        push(undo_stack, record_id)</w:t>
+      </w:r>
+    </w:p>
+    <w:p>
+      <w:pPr>
+        <w:spacing w:after="0" w:line="228"/>
+      </w:pPr>
+      <w:r>
+        <w:rPr>
+          <w:rFonts w:ascii="Courier New" w:cs="Courier New" w:eastAsia="Courier New" w:hAnsi="Courier New"/>
+          <w:sz w:val="16"/>
+          <w:szCs w:val="16"/>
+        </w:rPr>
+        <w:t xml:space="preserve">        print("Undo cancelled.")</w:t>
+      </w:r>
+    </w:p>
+    <w:p>
+      <w:pPr>
+        <w:spacing w:after="0" w:line="228"/>
+      </w:pPr>
+      <w:r>
+        <w:rPr>
+          <w:rFonts w:ascii="Courier New" w:cs="Courier New" w:eastAsia="Courier New" w:hAnsi="Courier New"/>
+          <w:sz w:val="16"/>
+          <w:szCs w:val="16"/>
+        </w:rPr>
+        <w:t xml:space="preserve"> </w:t>
+      </w:r>
+    </w:p>
+    <w:p>
+      <w:pPr>
+        <w:spacing w:after="0" w:line="228"/>
+      </w:pPr>
+      <w:r>
+        <w:rPr>
+          <w:rFonts w:ascii="Courier New" w:cs="Courier New" w:eastAsia="Courier New" w:hAnsi="Courier New"/>
+          <w:sz w:val="16"/>
+          <w:szCs w:val="16"/>
+        </w:rPr>
+        <w:t xml:space="preserve"> </w:t>
+      </w:r>
+    </w:p>
+    <w:p>
+      <w:pPr>
+        <w:spacing w:after="0" w:line="228"/>
+      </w:pPr>
+      <w:r>
+        <w:rPr>
+          <w:rFonts w:ascii="Courier New" w:cs="Courier New" w:eastAsia="Courier New" w:hAnsi="Courier New"/>
+          <w:sz w:val="16"/>
+          <w:szCs w:val="16"/>
+        </w:rPr>
         <w:t xml:space="preserve"># ---------------- Summaries ----------------</w:t>
       </w:r>
     </w:p>
@@ -19425,6 +20302,19 @@
           <w:sz w:val="16"/>
           <w:szCs w:val="16"/>
         </w:rPr>
+        <w:t xml:space="preserve">    print("* Option 14 removes records added in this session, newest first.")</w:t>
+      </w:r>
+    </w:p>
+    <w:p>
+      <w:pPr>
+        <w:spacing w:after="0" w:line="228"/>
+      </w:pPr>
+      <w:r>
+        <w:rPr>
+          <w:rFonts w:ascii="Courier New" w:cs="Courier New" w:eastAsia="Courier New" w:hAnsi="Courier New"/>
+          <w:sz w:val="16"/>
+          <w:szCs w:val="16"/>
+        </w:rPr>
         <w:t xml:space="preserve"> </w:t>
       </w:r>
     </w:p>
@@ -19672,6 +20562,19 @@
           <w:sz w:val="16"/>
           <w:szCs w:val="16"/>
         </w:rPr>
+        <w:t xml:space="preserve">    print("14. Undo Last Added Record")</w:t>
+      </w:r>
+    </w:p>
+    <w:p>
+      <w:pPr>
+        <w:spacing w:after="0" w:line="228"/>
+      </w:pPr>
+      <w:r>
+        <w:rPr>
+          <w:rFonts w:ascii="Courier New" w:cs="Courier New" w:eastAsia="Courier New" w:hAnsi="Courier New"/>
+          <w:sz w:val="16"/>
+          <w:szCs w:val="16"/>
+        </w:rPr>
         <w:t xml:space="preserve">    print("0. Exit")</w:t>
       </w:r>
     </w:p>
@@ -19932,7 +20835,7 @@
           <w:sz w:val="16"/>
           <w:szCs w:val="16"/>
         </w:rPr>
-        <w:t xml:space="preserve">        "12": manage_emission_factors, "13": show_help,</w:t>
+        <w:t xml:space="preserve">        "12": manage_emission_factors, "13": show_help, "14": undo_last_record,</w:t>
       </w:r>
     </w:p>
     <w:p>
@@ -20179,7 +21082,7 @@
           <w:sz w:val="16"/>
           <w:szCs w:val="16"/>
         </w:rPr>
-        <w:t xml:space="preserve">                print("Invalid choice! Please enter a number from 0 to 13.")</w:t>
+        <w:t xml:space="preserve">                print("Invalid choice! Please enter a number from 0 to 14.")</w:t>
       </w:r>
     </w:p>
     <w:p>
@@ -20331,7 +21234,7 @@
       <w:r>
         <w:drawing>
           <wp:inline distT="0" distB="0" distL="0" distR="0">
-            <wp:extent cx="4695825" cy="2524125"/>
+            <wp:extent cx="4695825" cy="2628900"/>
             <wp:effectExtent t="0" r="0" b="0" l="0"/>
             <wp:docPr id="1" name="01_main_menu" descr="Main menu" title="Main menu"/>
             <wp:cNvGraphicFramePr>
@@ -20356,7 +21259,7 @@
                   <pic:spPr bwMode="auto">
                     <a:xfrm>
                       <a:off x="0" y="0"/>
-                      <a:ext cx="4695825" cy="2524125"/>
+                      <a:ext cx="4695825" cy="2628900"/>
                     </a:xfrm>
                     <a:prstGeom prst="rect">
                       <a:avLst/>
@@ -21276,7 +22179,7 @@
       <w:r>
         <w:drawing>
           <wp:inline distT="0" distB="0" distL="0" distR="0">
-            <wp:extent cx="4695825" cy="1724025"/>
+            <wp:extent cx="4695825" cy="1838325"/>
             <wp:effectExtent t="0" r="0" b="0" l="0"/>
             <wp:docPr id="1" name="14_help" descr="Help screen (option 13)" title="Help screen (option 13)"/>
             <wp:cNvGraphicFramePr>
@@ -21301,7 +22204,7 @@
                   <pic:spPr bwMode="auto">
                     <a:xfrm>
                       <a:off x="0" y="0"/>
-                      <a:ext cx="4695825" cy="1724025"/>
+                      <a:ext cx="4695825" cy="1838325"/>
                     </a:xfrm>
                     <a:prstGeom prst="rect">
                       <a:avLst/>
@@ -21339,9 +22242,9 @@
       <w:r>
         <w:drawing>
           <wp:inline distT="0" distB="0" distL="0" distR="0">
-            <wp:extent cx="4695825" cy="5934075"/>
+            <wp:extent cx="4695825" cy="2971800"/>
             <wp:effectExtent t="0" r="0" b="0" l="0"/>
-            <wp:docPr id="1" name="15_errors" descr="Error handling: invalid menu choice, category ID, date, quantity and record ID" title="Error handling: invalid menu choice, category ID, date, quantity and record ID"/>
+            <wp:docPr id="1" name="18_undo" descr="Undo Last Added Record using a stack, and the empty-stack message (option 14)" title="Undo Last Added Record using a stack, and the empty-stack message (option 14)"/>
             <wp:cNvGraphicFramePr>
               <a:graphicFrameLocks xmlns:a="http://schemas.openxmlformats.org/drawingml/2006/main" noChangeAspect="1"/>
             </wp:cNvGraphicFramePr>
@@ -21364,6 +22267,69 @@
                   <pic:spPr bwMode="auto">
                     <a:xfrm>
                       <a:off x="0" y="0"/>
+                      <a:ext cx="4695825" cy="2971800"/>
+                    </a:xfrm>
+                    <a:prstGeom prst="rect">
+                      <a:avLst/>
+                    </a:prstGeom>
+                  </pic:spPr>
+                </pic:pic>
+              </a:graphicData>
+            </a:graphic>
+          </wp:inline>
+        </w:drawing>
+      </w:r>
+    </w:p>
+    <w:p>
+      <w:pPr>
+        <w:spacing w:after="240"/>
+        <w:jc w:val="center"/>
+      </w:pPr>
+      <w:r>
+        <w:rPr>
+          <w:rFonts w:ascii="Times New Roman" w:cs="Times New Roman" w:eastAsia="Times New Roman" w:hAnsi="Times New Roman"/>
+          <w:i/>
+          <w:iCs/>
+          <w:sz w:val="21"/>
+          <w:szCs w:val="21"/>
+        </w:rPr>
+        <w:t xml:space="preserve">Figure 17: Undo Last Added Record using a stack, and the empty-stack message (option 14)</w:t>
+      </w:r>
+    </w:p>
+    <w:p>
+      <w:pPr>
+        <w:keepNext/>
+        <w:spacing w:after="60" w:before="120"/>
+        <w:jc w:val="center"/>
+      </w:pPr>
+      <w:r>
+        <w:drawing>
+          <wp:inline distT="0" distB="0" distL="0" distR="0">
+            <wp:extent cx="4695825" cy="5934075"/>
+            <wp:effectExtent t="0" r="0" b="0" l="0"/>
+            <wp:docPr id="1" name="15_errors" descr="Error handling: invalid menu choice, category ID, date, quantity and record ID" title="Error handling: invalid menu choice, category ID, date, quantity and record ID"/>
+            <wp:cNvGraphicFramePr>
+              <a:graphicFrameLocks xmlns:a="http://schemas.openxmlformats.org/drawingml/2006/main" noChangeAspect="1"/>
+            </wp:cNvGraphicFramePr>
+            <a:graphic xmlns:a="http://schemas.openxmlformats.org/drawingml/2006/main">
+              <a:graphicData uri="http://schemas.openxmlformats.org/drawingml/2006/picture">
+                <pic:pic xmlns:pic="http://schemas.openxmlformats.org/drawingml/2006/picture">
+                  <pic:nvPicPr>
+                    <pic:cNvPr id="0" name="" descr=""/>
+                    <pic:cNvPicPr>
+                      <a:picLocks noChangeAspect="1" noChangeArrowheads="1"/>
+                    </pic:cNvPicPr>
+                  </pic:nvPicPr>
+                  <pic:blipFill>
+                    <a:blip r:embed="rId28" cstate="none"/>
+                    <a:srcRect/>
+                    <a:stretch>
+                      <a:fillRect/>
+                    </a:stretch>
+                  </pic:blipFill>
+                  <pic:spPr bwMode="auto">
+                    <a:xfrm>
+                      <a:off x="0" y="0"/>
                       <a:ext cx="4695825" cy="5934075"/>
                     </a:xfrm>
                     <a:prstGeom prst="rect">
@@ -21390,7 +22356,7 @@
           <w:sz w:val="21"/>
           <w:szCs w:val="21"/>
         </w:rPr>
-        <w:t xml:space="preserve">Figure 17: Error handling: invalid menu choice, category ID, date, quantity and record ID</w:t>
+        <w:t xml:space="preserve">Figure 18: Error handling: invalid menu choice, category ID, date, quantity and record ID</w:t>
       </w:r>
     </w:p>
     <w:p>
@@ -23616,6 +24582,490 @@
           </w:p>
         </w:tc>
       </w:tr>
+      <w:tr>
+        <w:trPr>
+          <w:tblHeader w:val="false"/>
+        </w:trPr>
+        <w:tc>
+          <w:tcPr>
+            <w:tcW w:type="dxa" w:w="600"/>
+            <w:tcBorders>
+              <w:top w:val="single" w:color="808080" w:sz="4"/>
+              <w:left w:val="single" w:color="808080" w:sz="4"/>
+              <w:bottom w:val="single" w:color="808080" w:sz="4"/>
+              <w:right w:val="single" w:color="808080" w:sz="4"/>
+            </w:tcBorders>
+            <w:tcMar>
+              <w:top w:type="dxa" w:w="60"/>
+              <w:left w:type="dxa" w:w="100"/>
+              <w:bottom w:type="dxa" w:w="60"/>
+              <w:right w:type="dxa" w:w="100"/>
+            </w:tcMar>
+          </w:tcPr>
+          <w:p>
+            <w:r>
+              <w:rPr>
+                <w:rFonts w:ascii="Times New Roman" w:cs="Times New Roman" w:eastAsia="Times New Roman" w:hAnsi="Times New Roman"/>
+                <w:b w:val="false"/>
+                <w:bCs w:val="false"/>
+                <w:sz w:val="21"/>
+                <w:szCs w:val="21"/>
+              </w:rPr>
+              <w:t xml:space="preserve">18</w:t>
+            </w:r>
+          </w:p>
+        </w:tc>
+        <w:tc>
+          <w:tcPr>
+            <w:tcW w:type="dxa" w:w="3000"/>
+            <w:tcBorders>
+              <w:top w:val="single" w:color="808080" w:sz="4"/>
+              <w:left w:val="single" w:color="808080" w:sz="4"/>
+              <w:bottom w:val="single" w:color="808080" w:sz="4"/>
+              <w:right w:val="single" w:color="808080" w:sz="4"/>
+            </w:tcBorders>
+            <w:tcMar>
+              <w:top w:type="dxa" w:w="60"/>
+              <w:left w:type="dxa" w:w="100"/>
+              <w:bottom w:type="dxa" w:w="60"/>
+              <w:right w:type="dxa" w:w="100"/>
+            </w:tcMar>
+          </w:tcPr>
+          <w:p>
+            <w:r>
+              <w:rPr>
+                <w:rFonts w:ascii="Times New Roman" w:cs="Times New Roman" w:eastAsia="Times New Roman" w:hAnsi="Times New Roman"/>
+                <w:b w:val="false"/>
+                <w:bCs w:val="false"/>
+                <w:sz w:val="21"/>
+                <w:szCs w:val="21"/>
+              </w:rPr>
+              <w:t xml:space="preserve">Undo after adding 3 records</w:t>
+            </w:r>
+          </w:p>
+        </w:tc>
+        <w:tc>
+          <w:tcPr>
+            <w:tcW w:type="dxa" w:w="3200"/>
+            <w:tcBorders>
+              <w:top w:val="single" w:color="808080" w:sz="4"/>
+              <w:left w:val="single" w:color="808080" w:sz="4"/>
+              <w:bottom w:val="single" w:color="808080" w:sz="4"/>
+              <w:right w:val="single" w:color="808080" w:sz="4"/>
+            </w:tcBorders>
+            <w:tcMar>
+              <w:top w:type="dxa" w:w="60"/>
+              <w:left w:type="dxa" w:w="100"/>
+              <w:bottom w:type="dxa" w:w="60"/>
+              <w:right w:type="dxa" w:w="100"/>
+            </w:tcMar>
+          </w:tcPr>
+          <w:p>
+            <w:r>
+              <w:rPr>
+                <w:rFonts w:ascii="Times New Roman" w:cs="Times New Roman" w:eastAsia="Times New Roman" w:hAnsi="Times New Roman"/>
+                <w:b w:val="false"/>
+                <w:bCs w:val="false"/>
+                <w:sz w:val="21"/>
+                <w:szCs w:val="21"/>
+              </w:rPr>
+              <w:t xml:space="preserve">Option 14, Y</w:t>
+            </w:r>
+          </w:p>
+        </w:tc>
+        <w:tc>
+          <w:tcPr>
+            <w:tcW w:type="dxa" w:w="2838"/>
+            <w:tcBorders>
+              <w:top w:val="single" w:color="808080" w:sz="4"/>
+              <w:left w:val="single" w:color="808080" w:sz="4"/>
+              <w:bottom w:val="single" w:color="808080" w:sz="4"/>
+              <w:right w:val="single" w:color="808080" w:sz="4"/>
+            </w:tcBorders>
+            <w:tcMar>
+              <w:top w:type="dxa" w:w="60"/>
+              <w:left w:type="dxa" w:w="100"/>
+              <w:bottom w:type="dxa" w:w="60"/>
+              <w:right w:type="dxa" w:w="100"/>
+            </w:tcMar>
+          </w:tcPr>
+          <w:p>
+            <w:r>
+              <w:rPr>
+                <w:rFonts w:ascii="Times New Roman" w:cs="Times New Roman" w:eastAsia="Times New Roman" w:hAnsi="Times New Roman"/>
+                <w:b w:val="false"/>
+                <w:bCs w:val="false"/>
+                <w:sz w:val="21"/>
+                <w:szCs w:val="21"/>
+              </w:rPr>
+              <w:t xml:space="preserve">Newest record removed first (LIFO)</w:t>
+            </w:r>
+          </w:p>
+        </w:tc>
+      </w:tr>
+      <w:tr>
+        <w:trPr>
+          <w:tblHeader w:val="false"/>
+        </w:trPr>
+        <w:tc>
+          <w:tcPr>
+            <w:tcW w:type="dxa" w:w="600"/>
+            <w:tcBorders>
+              <w:top w:val="single" w:color="808080" w:sz="4"/>
+              <w:left w:val="single" w:color="808080" w:sz="4"/>
+              <w:bottom w:val="single" w:color="808080" w:sz="4"/>
+              <w:right w:val="single" w:color="808080" w:sz="4"/>
+            </w:tcBorders>
+            <w:tcMar>
+              <w:top w:type="dxa" w:w="60"/>
+              <w:left w:type="dxa" w:w="100"/>
+              <w:bottom w:type="dxa" w:w="60"/>
+              <w:right w:type="dxa" w:w="100"/>
+            </w:tcMar>
+          </w:tcPr>
+          <w:p>
+            <w:r>
+              <w:rPr>
+                <w:rFonts w:ascii="Times New Roman" w:cs="Times New Roman" w:eastAsia="Times New Roman" w:hAnsi="Times New Roman"/>
+                <w:b w:val="false"/>
+                <w:bCs w:val="false"/>
+                <w:sz w:val="21"/>
+                <w:szCs w:val="21"/>
+              </w:rPr>
+              <w:t xml:space="preserve">19</w:t>
+            </w:r>
+          </w:p>
+        </w:tc>
+        <w:tc>
+          <w:tcPr>
+            <w:tcW w:type="dxa" w:w="3000"/>
+            <w:tcBorders>
+              <w:top w:val="single" w:color="808080" w:sz="4"/>
+              <w:left w:val="single" w:color="808080" w:sz="4"/>
+              <w:bottom w:val="single" w:color="808080" w:sz="4"/>
+              <w:right w:val="single" w:color="808080" w:sz="4"/>
+            </w:tcBorders>
+            <w:tcMar>
+              <w:top w:type="dxa" w:w="60"/>
+              <w:left w:type="dxa" w:w="100"/>
+              <w:bottom w:type="dxa" w:w="60"/>
+              <w:right w:type="dxa" w:w="100"/>
+            </w:tcMar>
+          </w:tcPr>
+          <w:p>
+            <w:r>
+              <w:rPr>
+                <w:rFonts w:ascii="Times New Roman" w:cs="Times New Roman" w:eastAsia="Times New Roman" w:hAnsi="Times New Roman"/>
+                <w:b w:val="false"/>
+                <w:bCs w:val="false"/>
+                <w:sz w:val="21"/>
+                <w:szCs w:val="21"/>
+              </w:rPr>
+              <w:t xml:space="preserve">Cancel undo</w:t>
+            </w:r>
+          </w:p>
+        </w:tc>
+        <w:tc>
+          <w:tcPr>
+            <w:tcW w:type="dxa" w:w="3200"/>
+            <w:tcBorders>
+              <w:top w:val="single" w:color="808080" w:sz="4"/>
+              <w:left w:val="single" w:color="808080" w:sz="4"/>
+              <w:bottom w:val="single" w:color="808080" w:sz="4"/>
+              <w:right w:val="single" w:color="808080" w:sz="4"/>
+            </w:tcBorders>
+            <w:tcMar>
+              <w:top w:type="dxa" w:w="60"/>
+              <w:left w:type="dxa" w:w="100"/>
+              <w:bottom w:type="dxa" w:w="60"/>
+              <w:right w:type="dxa" w:w="100"/>
+            </w:tcMar>
+          </w:tcPr>
+          <w:p>
+            <w:r>
+              <w:rPr>
+                <w:rFonts w:ascii="Times New Roman" w:cs="Times New Roman" w:eastAsia="Times New Roman" w:hAnsi="Times New Roman"/>
+                <w:b w:val="false"/>
+                <w:bCs w:val="false"/>
+                <w:sz w:val="21"/>
+                <w:szCs w:val="21"/>
+              </w:rPr>
+              <w:t xml:space="preserve">Option 14, N</w:t>
+            </w:r>
+          </w:p>
+        </w:tc>
+        <w:tc>
+          <w:tcPr>
+            <w:tcW w:type="dxa" w:w="2838"/>
+            <w:tcBorders>
+              <w:top w:val="single" w:color="808080" w:sz="4"/>
+              <w:left w:val="single" w:color="808080" w:sz="4"/>
+              <w:bottom w:val="single" w:color="808080" w:sz="4"/>
+              <w:right w:val="single" w:color="808080" w:sz="4"/>
+            </w:tcBorders>
+            <w:tcMar>
+              <w:top w:type="dxa" w:w="60"/>
+              <w:left w:type="dxa" w:w="100"/>
+              <w:bottom w:type="dxa" w:w="60"/>
+              <w:right w:type="dxa" w:w="100"/>
+            </w:tcMar>
+          </w:tcPr>
+          <w:p>
+            <w:r>
+              <w:rPr>
+                <w:rFonts w:ascii="Times New Roman" w:cs="Times New Roman" w:eastAsia="Times New Roman" w:hAnsi="Times New Roman"/>
+                <w:b w:val="false"/>
+                <w:bCs w:val="false"/>
+                <w:sz w:val="21"/>
+                <w:szCs w:val="21"/>
+              </w:rPr>
+              <w:t xml:space="preserve">"Undo cancelled", record can be undone later</w:t>
+            </w:r>
+          </w:p>
+        </w:tc>
+      </w:tr>
+      <w:tr>
+        <w:trPr>
+          <w:tblHeader w:val="false"/>
+        </w:trPr>
+        <w:tc>
+          <w:tcPr>
+            <w:tcW w:type="dxa" w:w="600"/>
+            <w:tcBorders>
+              <w:top w:val="single" w:color="808080" w:sz="4"/>
+              <w:left w:val="single" w:color="808080" w:sz="4"/>
+              <w:bottom w:val="single" w:color="808080" w:sz="4"/>
+              <w:right w:val="single" w:color="808080" w:sz="4"/>
+            </w:tcBorders>
+            <w:tcMar>
+              <w:top w:type="dxa" w:w="60"/>
+              <w:left w:type="dxa" w:w="100"/>
+              <w:bottom w:type="dxa" w:w="60"/>
+              <w:right w:type="dxa" w:w="100"/>
+            </w:tcMar>
+          </w:tcPr>
+          <w:p>
+            <w:r>
+              <w:rPr>
+                <w:rFonts w:ascii="Times New Roman" w:cs="Times New Roman" w:eastAsia="Times New Roman" w:hAnsi="Times New Roman"/>
+                <w:b w:val="false"/>
+                <w:bCs w:val="false"/>
+                <w:sz w:val="21"/>
+                <w:szCs w:val="21"/>
+              </w:rPr>
+              <w:t xml:space="preserve">20</w:t>
+            </w:r>
+          </w:p>
+        </w:tc>
+        <w:tc>
+          <w:tcPr>
+            <w:tcW w:type="dxa" w:w="3000"/>
+            <w:tcBorders>
+              <w:top w:val="single" w:color="808080" w:sz="4"/>
+              <w:left w:val="single" w:color="808080" w:sz="4"/>
+              <w:bottom w:val="single" w:color="808080" w:sz="4"/>
+              <w:right w:val="single" w:color="808080" w:sz="4"/>
+            </w:tcBorders>
+            <w:tcMar>
+              <w:top w:type="dxa" w:w="60"/>
+              <w:left w:type="dxa" w:w="100"/>
+              <w:bottom w:type="dxa" w:w="60"/>
+              <w:right w:type="dxa" w:w="100"/>
+            </w:tcMar>
+          </w:tcPr>
+          <w:p>
+            <w:r>
+              <w:rPr>
+                <w:rFonts w:ascii="Times New Roman" w:cs="Times New Roman" w:eastAsia="Times New Roman" w:hAnsi="Times New Roman"/>
+                <w:b w:val="false"/>
+                <w:bCs w:val="false"/>
+                <w:sz w:val="21"/>
+                <w:szCs w:val="21"/>
+              </w:rPr>
+              <w:t xml:space="preserve">Undo a record already deleted</w:t>
+            </w:r>
+          </w:p>
+        </w:tc>
+        <w:tc>
+          <w:tcPr>
+            <w:tcW w:type="dxa" w:w="3200"/>
+            <w:tcBorders>
+              <w:top w:val="single" w:color="808080" w:sz="4"/>
+              <w:left w:val="single" w:color="808080" w:sz="4"/>
+              <w:bottom w:val="single" w:color="808080" w:sz="4"/>
+              <w:right w:val="single" w:color="808080" w:sz="4"/>
+            </w:tcBorders>
+            <w:tcMar>
+              <w:top w:type="dxa" w:w="60"/>
+              <w:left w:type="dxa" w:w="100"/>
+              <w:bottom w:type="dxa" w:w="60"/>
+              <w:right w:type="dxa" w:w="100"/>
+            </w:tcMar>
+          </w:tcPr>
+          <w:p>
+            <w:r>
+              <w:rPr>
+                <w:rFonts w:ascii="Times New Roman" w:cs="Times New Roman" w:eastAsia="Times New Roman" w:hAnsi="Times New Roman"/>
+                <w:b w:val="false"/>
+                <w:bCs w:val="false"/>
+                <w:sz w:val="21"/>
+                <w:szCs w:val="21"/>
+              </w:rPr>
+              <w:t xml:space="preserve">Delete with option 5, then option 14</w:t>
+            </w:r>
+          </w:p>
+        </w:tc>
+        <w:tc>
+          <w:tcPr>
+            <w:tcW w:type="dxa" w:w="2838"/>
+            <w:tcBorders>
+              <w:top w:val="single" w:color="808080" w:sz="4"/>
+              <w:left w:val="single" w:color="808080" w:sz="4"/>
+              <w:bottom w:val="single" w:color="808080" w:sz="4"/>
+              <w:right w:val="single" w:color="808080" w:sz="4"/>
+            </w:tcBorders>
+            <w:tcMar>
+              <w:top w:type="dxa" w:w="60"/>
+              <w:left w:type="dxa" w:w="100"/>
+              <w:bottom w:type="dxa" w:w="60"/>
+              <w:right w:type="dxa" w:w="100"/>
+            </w:tcMar>
+          </w:tcPr>
+          <w:p>
+            <w:r>
+              <w:rPr>
+                <w:rFonts w:ascii="Times New Roman" w:cs="Times New Roman" w:eastAsia="Times New Roman" w:hAnsi="Times New Roman"/>
+                <w:b w:val="false"/>
+                <w:bCs w:val="false"/>
+                <w:sz w:val="21"/>
+                <w:szCs w:val="21"/>
+              </w:rPr>
+              <w:t xml:space="preserve">"Record … was already deleted"</w:t>
+            </w:r>
+          </w:p>
+        </w:tc>
+      </w:tr>
+      <w:tr>
+        <w:trPr>
+          <w:tblHeader w:val="false"/>
+        </w:trPr>
+        <w:tc>
+          <w:tcPr>
+            <w:tcW w:type="dxa" w:w="600"/>
+            <w:tcBorders>
+              <w:top w:val="single" w:color="808080" w:sz="4"/>
+              <w:left w:val="single" w:color="808080" w:sz="4"/>
+              <w:bottom w:val="single" w:color="808080" w:sz="4"/>
+              <w:right w:val="single" w:color="808080" w:sz="4"/>
+            </w:tcBorders>
+            <w:tcMar>
+              <w:top w:type="dxa" w:w="60"/>
+              <w:left w:type="dxa" w:w="100"/>
+              <w:bottom w:type="dxa" w:w="60"/>
+              <w:right w:type="dxa" w:w="100"/>
+            </w:tcMar>
+          </w:tcPr>
+          <w:p>
+            <w:r>
+              <w:rPr>
+                <w:rFonts w:ascii="Times New Roman" w:cs="Times New Roman" w:eastAsia="Times New Roman" w:hAnsi="Times New Roman"/>
+                <w:b w:val="false"/>
+                <w:bCs w:val="false"/>
+                <w:sz w:val="21"/>
+                <w:szCs w:val="21"/>
+              </w:rPr>
+              <w:t xml:space="preserve">21</w:t>
+            </w:r>
+          </w:p>
+        </w:tc>
+        <w:tc>
+          <w:tcPr>
+            <w:tcW w:type="dxa" w:w="3000"/>
+            <w:tcBorders>
+              <w:top w:val="single" w:color="808080" w:sz="4"/>
+              <w:left w:val="single" w:color="808080" w:sz="4"/>
+              <w:bottom w:val="single" w:color="808080" w:sz="4"/>
+              <w:right w:val="single" w:color="808080" w:sz="4"/>
+            </w:tcBorders>
+            <w:tcMar>
+              <w:top w:type="dxa" w:w="60"/>
+              <w:left w:type="dxa" w:w="100"/>
+              <w:bottom w:type="dxa" w:w="60"/>
+              <w:right w:type="dxa" w:w="100"/>
+            </w:tcMar>
+          </w:tcPr>
+          <w:p>
+            <w:r>
+              <w:rPr>
+                <w:rFonts w:ascii="Times New Roman" w:cs="Times New Roman" w:eastAsia="Times New Roman" w:hAnsi="Times New Roman"/>
+                <w:b w:val="false"/>
+                <w:bCs w:val="false"/>
+                <w:sz w:val="21"/>
+                <w:szCs w:val="21"/>
+              </w:rPr>
+              <w:t xml:space="preserve">Undo with empty stack</w:t>
+            </w:r>
+          </w:p>
+        </w:tc>
+        <w:tc>
+          <w:tcPr>
+            <w:tcW w:type="dxa" w:w="3200"/>
+            <w:tcBorders>
+              <w:top w:val="single" w:color="808080" w:sz="4"/>
+              <w:left w:val="single" w:color="808080" w:sz="4"/>
+              <w:bottom w:val="single" w:color="808080" w:sz="4"/>
+              <w:right w:val="single" w:color="808080" w:sz="4"/>
+            </w:tcBorders>
+            <w:tcMar>
+              <w:top w:type="dxa" w:w="60"/>
+              <w:left w:type="dxa" w:w="100"/>
+              <w:bottom w:type="dxa" w:w="60"/>
+              <w:right w:type="dxa" w:w="100"/>
+            </w:tcMar>
+          </w:tcPr>
+          <w:p>
+            <w:r>
+              <w:rPr>
+                <w:rFonts w:ascii="Times New Roman" w:cs="Times New Roman" w:eastAsia="Times New Roman" w:hAnsi="Times New Roman"/>
+                <w:b w:val="false"/>
+                <w:bCs w:val="false"/>
+                <w:sz w:val="21"/>
+                <w:szCs w:val="21"/>
+              </w:rPr>
+              <w:t xml:space="preserve">Option 14</w:t>
+            </w:r>
+          </w:p>
+        </w:tc>
+        <w:tc>
+          <w:tcPr>
+            <w:tcW w:type="dxa" w:w="2838"/>
+            <w:tcBorders>
+              <w:top w:val="single" w:color="808080" w:sz="4"/>
+              <w:left w:val="single" w:color="808080" w:sz="4"/>
+              <w:bottom w:val="single" w:color="808080" w:sz="4"/>
+              <w:right w:val="single" w:color="808080" w:sz="4"/>
+            </w:tcBorders>
+            <w:tcMar>
+              <w:top w:type="dxa" w:w="60"/>
+              <w:left w:type="dxa" w:w="100"/>
+              <w:bottom w:type="dxa" w:w="60"/>
+              <w:right w:type="dxa" w:w="100"/>
+            </w:tcMar>
+          </w:tcPr>
+          <w:p>
+            <w:r>
+              <w:rPr>
+                <w:rFonts w:ascii="Times New Roman" w:cs="Times New Roman" w:eastAsia="Times New Roman" w:hAnsi="Times New Roman"/>
+                <w:b w:val="false"/>
+                <w:bCs w:val="false"/>
+                <w:sz w:val="21"/>
+                <w:szCs w:val="21"/>
+              </w:rPr>
+              <w:t xml:space="preserve">"Nothing to undo"</w:t>
+            </w:r>
+          </w:p>
+        </w:tc>
+      </w:tr>
     </w:tbl>
     <w:p>
       <w:pPr>
@@ -23704,6 +25154,24 @@
           <w:szCs w:val="24"/>
         </w:rPr>
         <w:t xml:space="preserve">Changing an emission factor does not recalculate old records; each record keeps the estimate made when it was saved.</w:t>
+      </w:r>
+    </w:p>
+    <w:p>
+      <w:pPr>
+        <w:pStyle w:val="ListParagraph"/>
+        <w:numPr>
+          <w:ilvl w:val="0"/>
+          <w:numId w:val="2"/>
+        </w:numPr>
+        <w:spacing w:after="60" w:line="290"/>
+      </w:pPr>
+      <w:r>
+        <w:rPr>
+          <w:rFonts w:ascii="Times New Roman" w:cs="Times New Roman" w:eastAsia="Times New Roman" w:hAnsi="Times New Roman"/>
+          <w:sz w:val="24"/>
+          <w:szCs w:val="24"/>
+        </w:rPr>
+        <w:t xml:space="preserve">Undo works only for records added since the program was started, because the stack is kept in memory.</w:t>
       </w:r>
     </w:p>
     <w:p>

</xml_diff>

<commit_message>
Fix edge-case bugs: character set, end of input, date range, zero message
- Create the database with CHARACTER SET utf8mb4 (program and SQL script)
  so notes with the rupee sign or Hindi text are not rejected on servers
  that default to latin1 (e.g. MySQL 5.7).
- Catch EOFError with KeyboardInterrupt so Ctrl+D / Ctrl+Z ends the
  program cleanly and still closes the connection.
- validate_date() accepts only dates from the year 2000 up to today, which
  rejects future dates and typing mistakes such as 0026-09-15.
- get_positive_number() says 'The value must be greater than zero.' since
  it also reads emission factors.

README (sections 10.4, 10.8, 10.15, 10.16, new 10.22, SQL map,
troubleshooting), viva sheet (2 new questions, 61 in total) and project
report (text, function list, 4 new test cases, updated screenshots)
updated to match.

Co-Authored-By: Claude Opus 5.5 <noreply@anthropic.com>
Claude-Session: https://claude.ai/code/session_01DGpnhWwohK1ku2D2HQBEpd
</commit_message>
<xml_diff>
--- a/CarbonDataLogger/Project_Report.docx
+++ b/CarbonDataLogger/Project_Report.docx
@@ -630,6 +630,7 @@
       </w:tblGrid>
       <w:tr>
         <w:trPr>
+          <w:cantSplit/>
           <w:tblHeader/>
         </w:trPr>
         <w:tc>
@@ -695,6 +696,7 @@
       </w:tr>
       <w:tr>
         <w:trPr>
+          <w:cantSplit/>
           <w:tblHeader w:val="false"/>
         </w:trPr>
         <w:tc>
@@ -758,6 +760,7 @@
       </w:tr>
       <w:tr>
         <w:trPr>
+          <w:cantSplit/>
           <w:tblHeader w:val="false"/>
         </w:trPr>
         <w:tc>
@@ -821,6 +824,7 @@
       </w:tr>
       <w:tr>
         <w:trPr>
+          <w:cantSplit/>
           <w:tblHeader w:val="false"/>
         </w:trPr>
         <w:tc>
@@ -884,6 +888,7 @@
       </w:tr>
       <w:tr>
         <w:trPr>
+          <w:cantSplit/>
           <w:tblHeader w:val="false"/>
         </w:trPr>
         <w:tc>
@@ -947,6 +952,7 @@
       </w:tr>
       <w:tr>
         <w:trPr>
+          <w:cantSplit/>
           <w:tblHeader w:val="false"/>
         </w:trPr>
         <w:tc>
@@ -1010,6 +1016,7 @@
       </w:tr>
       <w:tr>
         <w:trPr>
+          <w:cantSplit/>
           <w:tblHeader w:val="false"/>
         </w:trPr>
         <w:tc>
@@ -1073,6 +1080,7 @@
       </w:tr>
       <w:tr>
         <w:trPr>
+          <w:cantSplit/>
           <w:tblHeader w:val="false"/>
         </w:trPr>
         <w:tc>
@@ -1136,6 +1144,7 @@
       </w:tr>
       <w:tr>
         <w:trPr>
+          <w:cantSplit/>
           <w:tblHeader w:val="false"/>
         </w:trPr>
         <w:tc>
@@ -1199,6 +1208,7 @@
       </w:tr>
       <w:tr>
         <w:trPr>
+          <w:cantSplit/>
           <w:tblHeader w:val="false"/>
         </w:trPr>
         <w:tc>
@@ -1262,6 +1272,7 @@
       </w:tr>
       <w:tr>
         <w:trPr>
+          <w:cantSplit/>
           <w:tblHeader w:val="false"/>
         </w:trPr>
         <w:tc>
@@ -1325,6 +1336,7 @@
       </w:tr>
       <w:tr>
         <w:trPr>
+          <w:cantSplit/>
           <w:tblHeader w:val="false"/>
         </w:trPr>
         <w:tc>
@@ -1388,6 +1400,7 @@
       </w:tr>
       <w:tr>
         <w:trPr>
+          <w:cantSplit/>
           <w:tblHeader w:val="false"/>
         </w:trPr>
         <w:tc>
@@ -1716,6 +1729,7 @@
       </w:tblGrid>
       <w:tr>
         <w:trPr>
+          <w:cantSplit/>
           <w:tblHeader/>
         </w:trPr>
         <w:tc>
@@ -1811,6 +1825,7 @@
       </w:tr>
       <w:tr>
         <w:trPr>
+          <w:cantSplit/>
           <w:tblHeader w:val="false"/>
         </w:trPr>
         <w:tc>
@@ -1903,6 +1918,7 @@
       </w:tr>
       <w:tr>
         <w:trPr>
+          <w:cantSplit/>
           <w:tblHeader w:val="false"/>
         </w:trPr>
         <w:tc>
@@ -1995,6 +2011,7 @@
       </w:tr>
       <w:tr>
         <w:trPr>
+          <w:cantSplit/>
           <w:tblHeader w:val="false"/>
         </w:trPr>
         <w:tc>
@@ -2087,6 +2104,7 @@
       </w:tr>
       <w:tr>
         <w:trPr>
+          <w:cantSplit/>
           <w:tblHeader w:val="false"/>
         </w:trPr>
         <w:tc>
@@ -2179,6 +2197,7 @@
       </w:tr>
       <w:tr>
         <w:trPr>
+          <w:cantSplit/>
           <w:tblHeader w:val="false"/>
         </w:trPr>
         <w:tc>
@@ -2271,6 +2290,7 @@
       </w:tr>
       <w:tr>
         <w:trPr>
+          <w:cantSplit/>
           <w:tblHeader w:val="false"/>
         </w:trPr>
         <w:tc>
@@ -2363,6 +2383,7 @@
       </w:tr>
       <w:tr>
         <w:trPr>
+          <w:cantSplit/>
           <w:tblHeader w:val="false"/>
         </w:trPr>
         <w:tc>
@@ -2455,6 +2476,7 @@
       </w:tr>
       <w:tr>
         <w:trPr>
+          <w:cantSplit/>
           <w:tblHeader w:val="false"/>
         </w:trPr>
         <w:tc>
@@ -2547,6 +2569,7 @@
       </w:tr>
       <w:tr>
         <w:trPr>
+          <w:cantSplit/>
           <w:tblHeader w:val="false"/>
         </w:trPr>
         <w:tc>
@@ -2639,6 +2662,7 @@
       </w:tr>
       <w:tr>
         <w:trPr>
+          <w:cantSplit/>
           <w:tblHeader w:val="false"/>
         </w:trPr>
         <w:tc>
@@ -2731,6 +2755,7 @@
       </w:tr>
       <w:tr>
         <w:trPr>
+          <w:cantSplit/>
           <w:tblHeader w:val="false"/>
         </w:trPr>
         <w:tc>
@@ -2823,6 +2848,7 @@
       </w:tr>
       <w:tr>
         <w:trPr>
+          <w:cantSplit/>
           <w:tblHeader w:val="false"/>
         </w:trPr>
         <w:tc>
@@ -2915,6 +2941,7 @@
       </w:tr>
       <w:tr>
         <w:trPr>
+          <w:cantSplit/>
           <w:tblHeader w:val="false"/>
         </w:trPr>
         <w:tc>
@@ -3007,6 +3034,7 @@
       </w:tr>
       <w:tr>
         <w:trPr>
+          <w:cantSplit/>
           <w:tblHeader w:val="false"/>
         </w:trPr>
         <w:tc>
@@ -3099,6 +3127,7 @@
       </w:tr>
       <w:tr>
         <w:trPr>
+          <w:cantSplit/>
           <w:tblHeader w:val="false"/>
         </w:trPr>
         <w:tc>
@@ -3225,6 +3254,7 @@
       </w:tblGrid>
       <w:tr>
         <w:trPr>
+          <w:cantSplit/>
           <w:tblHeader/>
         </w:trPr>
         <w:tc>
@@ -3290,6 +3320,7 @@
       </w:tr>
       <w:tr>
         <w:trPr>
+          <w:cantSplit/>
           <w:tblHeader w:val="false"/>
         </w:trPr>
         <w:tc>
@@ -3353,6 +3384,7 @@
       </w:tr>
       <w:tr>
         <w:trPr>
+          <w:cantSplit/>
           <w:tblHeader w:val="false"/>
         </w:trPr>
         <w:tc>
@@ -3416,6 +3448,7 @@
       </w:tr>
       <w:tr>
         <w:trPr>
+          <w:cantSplit/>
           <w:tblHeader w:val="false"/>
         </w:trPr>
         <w:tc>
@@ -3479,6 +3512,7 @@
       </w:tr>
       <w:tr>
         <w:trPr>
+          <w:cantSplit/>
           <w:tblHeader w:val="false"/>
         </w:trPr>
         <w:tc>
@@ -3572,6 +3606,7 @@
       </w:tblGrid>
       <w:tr>
         <w:trPr>
+          <w:cantSplit/>
           <w:tblHeader/>
         </w:trPr>
         <w:tc>
@@ -3637,6 +3672,7 @@
       </w:tr>
       <w:tr>
         <w:trPr>
+          <w:cantSplit/>
           <w:tblHeader w:val="false"/>
         </w:trPr>
         <w:tc>
@@ -3700,6 +3736,7 @@
       </w:tr>
       <w:tr>
         <w:trPr>
+          <w:cantSplit/>
           <w:tblHeader w:val="false"/>
         </w:trPr>
         <w:tc>
@@ -3763,6 +3800,7 @@
       </w:tr>
       <w:tr>
         <w:trPr>
+          <w:cantSplit/>
           <w:tblHeader w:val="false"/>
         </w:trPr>
         <w:tc>
@@ -3826,6 +3864,7 @@
       </w:tr>
       <w:tr>
         <w:trPr>
+          <w:cantSplit/>
           <w:tblHeader w:val="false"/>
         </w:trPr>
         <w:tc>
@@ -3889,6 +3928,7 @@
       </w:tr>
       <w:tr>
         <w:trPr>
+          <w:cantSplit/>
           <w:tblHeader w:val="false"/>
         </w:trPr>
         <w:tc>
@@ -4137,6 +4177,7 @@
       </w:tblGrid>
       <w:tr>
         <w:trPr>
+          <w:cantSplit/>
           <w:tblHeader/>
         </w:trPr>
         <w:tc>
@@ -4202,6 +4243,7 @@
       </w:tr>
       <w:tr>
         <w:trPr>
+          <w:cantSplit/>
           <w:tblHeader w:val="false"/>
         </w:trPr>
         <w:tc>
@@ -4265,6 +4307,7 @@
       </w:tr>
       <w:tr>
         <w:trPr>
+          <w:cantSplit/>
           <w:tblHeader w:val="false"/>
         </w:trPr>
         <w:tc>
@@ -4328,6 +4371,7 @@
       </w:tr>
       <w:tr>
         <w:trPr>
+          <w:cantSplit/>
           <w:tblHeader w:val="false"/>
         </w:trPr>
         <w:tc>
@@ -4421,6 +4465,7 @@
       </w:tblGrid>
       <w:tr>
         <w:trPr>
+          <w:cantSplit/>
           <w:tblHeader/>
         </w:trPr>
         <w:tc>
@@ -4486,6 +4531,7 @@
       </w:tr>
       <w:tr>
         <w:trPr>
+          <w:cantSplit/>
           <w:tblHeader w:val="false"/>
         </w:trPr>
         <w:tc>
@@ -4549,6 +4595,7 @@
       </w:tr>
       <w:tr>
         <w:trPr>
+          <w:cantSplit/>
           <w:tblHeader w:val="false"/>
         </w:trPr>
         <w:tc>
@@ -4612,6 +4659,7 @@
       </w:tr>
       <w:tr>
         <w:trPr>
+          <w:cantSplit/>
           <w:tblHeader w:val="false"/>
         </w:trPr>
         <w:tc>
@@ -4675,6 +4723,7 @@
       </w:tr>
       <w:tr>
         <w:trPr>
+          <w:cantSplit/>
           <w:tblHeader w:val="false"/>
         </w:trPr>
         <w:tc>
@@ -4738,6 +4787,7 @@
       </w:tr>
       <w:tr>
         <w:trPr>
+          <w:cantSplit/>
           <w:tblHeader w:val="false"/>
         </w:trPr>
         <w:tc>
@@ -4801,6 +4851,7 @@
       </w:tr>
       <w:tr>
         <w:trPr>
+          <w:cantSplit/>
           <w:tblHeader w:val="false"/>
         </w:trPr>
         <w:tc>
@@ -4857,13 +4908,14 @@
                 <w:sz w:val="21"/>
                 <w:szCs w:val="21"/>
               </w:rPr>
-              <w:t xml:space="preserve">try–except–finally for invalid numbers, dates, MySQL errors, duplicate names, file errors and Ctrl+C.</w:t>
+              <w:t xml:space="preserve">try–except–finally for invalid numbers, dates, MySQL errors, duplicate names, file errors, Ctrl+C (KeyboardInterrupt) and end of input (EOFError).</w:t>
             </w:r>
           </w:p>
         </w:tc>
       </w:tr>
       <w:tr>
         <w:trPr>
+          <w:cantSplit/>
           <w:tblHeader w:val="false"/>
         </w:trPr>
         <w:tc>
@@ -4927,6 +4979,7 @@
       </w:tr>
       <w:tr>
         <w:trPr>
+          <w:cantSplit/>
           <w:tblHeader w:val="false"/>
         </w:trPr>
         <w:tc>
@@ -4990,6 +5043,7 @@
       </w:tr>
       <w:tr>
         <w:trPr>
+          <w:cantSplit/>
           <w:tblHeader w:val="false"/>
         </w:trPr>
         <w:tc>
@@ -5046,13 +5100,14 @@
                 <w:sz w:val="21"/>
                 <w:szCs w:val="21"/>
               </w:rPr>
-              <w:t xml:space="preserve">CREATE DATABASE, CREATE TABLE with PRIMARY KEY, FOREIGN KEY, NOT NULL and UNIQUE.</w:t>
+              <w:t xml:space="preserve">CREATE DATABASE (with CHARACTER SET utf8mb4), CREATE TABLE with PRIMARY KEY, FOREIGN KEY, NOT NULL and UNIQUE.</w:t>
             </w:r>
           </w:p>
         </w:tc>
       </w:tr>
       <w:tr>
         <w:trPr>
+          <w:cantSplit/>
           <w:tblHeader w:val="false"/>
         </w:trPr>
         <w:tc>
@@ -5116,6 +5171,7 @@
       </w:tr>
       <w:tr>
         <w:trPr>
+          <w:cantSplit/>
           <w:tblHeader w:val="false"/>
         </w:trPr>
         <w:tc>
@@ -5179,6 +5235,7 @@
       </w:tr>
       <w:tr>
         <w:trPr>
+          <w:cantSplit/>
           <w:tblHeader w:val="false"/>
         </w:trPr>
         <w:tc>
@@ -5242,6 +5299,7 @@
       </w:tr>
       <w:tr>
         <w:trPr>
+          <w:cantSplit/>
           <w:tblHeader w:val="false"/>
         </w:trPr>
         <w:tc>
@@ -5305,6 +5363,7 @@
       </w:tr>
       <w:tr>
         <w:trPr>
+          <w:cantSplit/>
           <w:tblHeader w:val="false"/>
         </w:trPr>
         <w:tc>
@@ -5403,7 +5462,23 @@
           <w:sz w:val="24"/>
           <w:szCs w:val="24"/>
         </w:rPr>
-        <w:t xml:space="preserve">. It has two related tables.</w:t>
+        <w:t xml:space="preserve">. It has two related tables. The database is created with </w:t>
+      </w:r>
+      <w:r>
+        <w:rPr>
+          <w:rFonts w:ascii="Courier New" w:cs="Courier New" w:eastAsia="Courier New" w:hAnsi="Courier New"/>
+          <w:sz w:val="22"/>
+          <w:szCs w:val="22"/>
+        </w:rPr>
+        <w:t xml:space="preserve">CHARACTER SET utf8mb4</w:t>
+      </w:r>
+      <w:r>
+        <w:rPr>
+          <w:rFonts w:ascii="Times New Roman" w:cs="Times New Roman" w:eastAsia="Times New Roman" w:hAnsi="Times New Roman"/>
+          <w:sz w:val="24"/>
+          <w:szCs w:val="24"/>
+        </w:rPr>
+        <w:t xml:space="preserve">, so that notes can contain the rupee sign (₹) and Hindi text. Older servers such as MySQL 5.7 use latin1 by default, which cannot store them.</w:t>
       </w:r>
     </w:p>
     <w:p>
@@ -5448,6 +5523,7 @@
       </w:tblGrid>
       <w:tr>
         <w:trPr>
+          <w:cantSplit/>
           <w:tblHeader/>
         </w:trPr>
         <w:tc>
@@ -5573,6 +5649,7 @@
       </w:tr>
       <w:tr>
         <w:trPr>
+          <w:cantSplit/>
           <w:tblHeader w:val="false"/>
         </w:trPr>
         <w:tc>
@@ -5694,6 +5771,7 @@
       </w:tr>
       <w:tr>
         <w:trPr>
+          <w:cantSplit/>
           <w:tblHeader w:val="false"/>
         </w:trPr>
         <w:tc>
@@ -5815,6 +5893,7 @@
       </w:tr>
       <w:tr>
         <w:trPr>
+          <w:cantSplit/>
           <w:tblHeader w:val="false"/>
         </w:trPr>
         <w:tc>
@@ -5936,6 +6015,7 @@
       </w:tr>
       <w:tr>
         <w:trPr>
+          <w:cantSplit/>
           <w:tblHeader w:val="false"/>
         </w:trPr>
         <w:tc>
@@ -6103,6 +6183,7 @@
       </w:tblGrid>
       <w:tr>
         <w:trPr>
+          <w:cantSplit/>
           <w:tblHeader/>
         </w:trPr>
         <w:tc>
@@ -6228,6 +6309,7 @@
       </w:tr>
       <w:tr>
         <w:trPr>
+          <w:cantSplit/>
           <w:tblHeader w:val="false"/>
         </w:trPr>
         <w:tc>
@@ -6349,6 +6431,7 @@
       </w:tr>
       <w:tr>
         <w:trPr>
+          <w:cantSplit/>
           <w:tblHeader w:val="false"/>
         </w:trPr>
         <w:tc>
@@ -6470,6 +6553,7 @@
       </w:tr>
       <w:tr>
         <w:trPr>
+          <w:cantSplit/>
           <w:tblHeader w:val="false"/>
         </w:trPr>
         <w:tc>
@@ -6591,6 +6675,7 @@
       </w:tr>
       <w:tr>
         <w:trPr>
+          <w:cantSplit/>
           <w:tblHeader w:val="false"/>
         </w:trPr>
         <w:tc>
@@ -6712,6 +6797,7 @@
       </w:tr>
       <w:tr>
         <w:trPr>
+          <w:cantSplit/>
           <w:tblHeader w:val="false"/>
         </w:trPr>
         <w:tc>
@@ -6833,6 +6919,7 @@
       </w:tr>
       <w:tr>
         <w:trPr>
+          <w:cantSplit/>
           <w:tblHeader w:val="false"/>
         </w:trPr>
         <w:tc>
@@ -7076,6 +7163,7 @@
       </w:tblGrid>
       <w:tr>
         <w:trPr>
+          <w:cantSplit/>
           <w:tblHeader/>
         </w:trPr>
         <w:tc>
@@ -7201,6 +7289,7 @@
       </w:tr>
       <w:tr>
         <w:trPr>
+          <w:cantSplit/>
           <w:tblHeader w:val="false"/>
         </w:trPr>
         <w:tc>
@@ -7322,6 +7411,7 @@
       </w:tr>
       <w:tr>
         <w:trPr>
+          <w:cantSplit/>
           <w:tblHeader w:val="false"/>
         </w:trPr>
         <w:tc>
@@ -7443,6 +7533,7 @@
       </w:tr>
       <w:tr>
         <w:trPr>
+          <w:cantSplit/>
           <w:tblHeader w:val="false"/>
         </w:trPr>
         <w:tc>
@@ -7564,6 +7655,7 @@
       </w:tr>
       <w:tr>
         <w:trPr>
+          <w:cantSplit/>
           <w:tblHeader w:val="false"/>
         </w:trPr>
         <w:tc>
@@ -7685,6 +7777,7 @@
       </w:tr>
       <w:tr>
         <w:trPr>
+          <w:cantSplit/>
           <w:tblHeader w:val="false"/>
         </w:trPr>
         <w:tc>
@@ -7806,6 +7899,7 @@
       </w:tr>
       <w:tr>
         <w:trPr>
+          <w:cantSplit/>
           <w:tblHeader w:val="false"/>
         </w:trPr>
         <w:tc>
@@ -8093,6 +8187,7 @@
       </w:tblGrid>
       <w:tr>
         <w:trPr>
+          <w:cantSplit/>
           <w:tblHeader/>
         </w:trPr>
         <w:tc>
@@ -8158,6 +8253,7 @@
       </w:tr>
       <w:tr>
         <w:trPr>
+          <w:cantSplit/>
           <w:tblHeader w:val="false"/>
         </w:trPr>
         <w:tc>
@@ -8221,6 +8317,7 @@
       </w:tr>
       <w:tr>
         <w:trPr>
+          <w:cantSplit/>
           <w:tblHeader w:val="false"/>
         </w:trPr>
         <w:tc>
@@ -8284,6 +8381,7 @@
       </w:tr>
       <w:tr>
         <w:trPr>
+          <w:cantSplit/>
           <w:tblHeader w:val="false"/>
         </w:trPr>
         <w:tc>
@@ -8347,6 +8445,7 @@
       </w:tr>
       <w:tr>
         <w:trPr>
+          <w:cantSplit/>
           <w:tblHeader w:val="false"/>
         </w:trPr>
         <w:tc>
@@ -8410,6 +8509,7 @@
       </w:tr>
       <w:tr>
         <w:trPr>
+          <w:cantSplit/>
           <w:tblHeader w:val="false"/>
         </w:trPr>
         <w:tc>
@@ -8466,13 +8566,14 @@
                 <w:sz w:val="21"/>
                 <w:szCs w:val="21"/>
               </w:rPr>
-              <w:t xml:space="preserve">Repeats the question until a number greater than zero is entered.</w:t>
+              <w:t xml:space="preserve">Repeats the question until a number greater than zero is entered (used for quantities and emission factors).</w:t>
             </w:r>
           </w:p>
         </w:tc>
       </w:tr>
       <w:tr>
         <w:trPr>
+          <w:cantSplit/>
           <w:tblHeader w:val="false"/>
         </w:trPr>
         <w:tc>
@@ -8529,13 +8630,14 @@
                 <w:sz w:val="21"/>
                 <w:szCs w:val="21"/>
               </w:rPr>
-              <w:t xml:space="preserve">Returns the date in YYYY-MM-DD form, or None if it is invalid.</w:t>
+              <w:t xml:space="preserve">Returns the date in YYYY-MM-DD form, or None if it is impossible, before the year 2000 or after today.</w:t>
             </w:r>
           </w:p>
         </w:tc>
       </w:tr>
       <w:tr>
         <w:trPr>
+          <w:cantSplit/>
           <w:tblHeader w:val="false"/>
         </w:trPr>
         <w:tc>
@@ -8592,13 +8694,14 @@
                 <w:sz w:val="21"/>
                 <w:szCs w:val="21"/>
               </w:rPr>
-              <w:t xml:space="preserve">Asks for a valid date; Enter gives today's date.</w:t>
+              <w:t xml:space="preserve">Asks for a valid date from 2000 up to today; Enter gives today's date.</w:t>
             </w:r>
           </w:p>
         </w:tc>
       </w:tr>
       <w:tr>
         <w:trPr>
+          <w:cantSplit/>
           <w:tblHeader w:val="false"/>
         </w:trPr>
         <w:tc>
@@ -8662,6 +8765,7 @@
       </w:tr>
       <w:tr>
         <w:trPr>
+          <w:cantSplit/>
           <w:tblHeader w:val="false"/>
         </w:trPr>
         <w:tc>
@@ -8725,6 +8829,7 @@
       </w:tr>
       <w:tr>
         <w:trPr>
+          <w:cantSplit/>
           <w:tblHeader w:val="false"/>
         </w:trPr>
         <w:tc>
@@ -8788,6 +8893,7 @@
       </w:tr>
       <w:tr>
         <w:trPr>
+          <w:cantSplit/>
           <w:tblHeader w:val="false"/>
         </w:trPr>
         <w:tc>
@@ -8851,6 +8957,7 @@
       </w:tr>
       <w:tr>
         <w:trPr>
+          <w:cantSplit/>
           <w:tblHeader w:val="false"/>
         </w:trPr>
         <w:tc>
@@ -8914,6 +9021,7 @@
       </w:tr>
       <w:tr>
         <w:trPr>
+          <w:cantSplit/>
           <w:tblHeader w:val="false"/>
         </w:trPr>
         <w:tc>
@@ -8977,6 +9085,7 @@
       </w:tr>
       <w:tr>
         <w:trPr>
+          <w:cantSplit/>
           <w:tblHeader w:val="false"/>
         </w:trPr>
         <w:tc>
@@ -9040,6 +9149,7 @@
       </w:tr>
       <w:tr>
         <w:trPr>
+          <w:cantSplit/>
           <w:tblHeader w:val="false"/>
         </w:trPr>
         <w:tc>
@@ -9103,6 +9213,7 @@
       </w:tr>
       <w:tr>
         <w:trPr>
+          <w:cantSplit/>
           <w:tblHeader w:val="false"/>
         </w:trPr>
         <w:tc>
@@ -9166,6 +9277,7 @@
       </w:tr>
       <w:tr>
         <w:trPr>
+          <w:cantSplit/>
           <w:tblHeader w:val="false"/>
         </w:trPr>
         <w:tc>
@@ -9229,6 +9341,7 @@
       </w:tr>
       <w:tr>
         <w:trPr>
+          <w:cantSplit/>
           <w:tblHeader w:val="false"/>
         </w:trPr>
         <w:tc>
@@ -9292,6 +9405,7 @@
       </w:tr>
       <w:tr>
         <w:trPr>
+          <w:cantSplit/>
           <w:tblHeader w:val="false"/>
         </w:trPr>
         <w:tc>
@@ -9355,6 +9469,7 @@
       </w:tr>
       <w:tr>
         <w:trPr>
+          <w:cantSplit/>
           <w:tblHeader w:val="false"/>
         </w:trPr>
         <w:tc>
@@ -9418,6 +9533,7 @@
       </w:tr>
       <w:tr>
         <w:trPr>
+          <w:cantSplit/>
           <w:tblHeader w:val="false"/>
         </w:trPr>
         <w:tc>
@@ -9481,6 +9597,7 @@
       </w:tr>
       <w:tr>
         <w:trPr>
+          <w:cantSplit/>
           <w:tblHeader w:val="false"/>
         </w:trPr>
         <w:tc>
@@ -9544,6 +9661,7 @@
       </w:tr>
       <w:tr>
         <w:trPr>
+          <w:cantSplit/>
           <w:tblHeader w:val="false"/>
         </w:trPr>
         <w:tc>
@@ -9607,6 +9725,7 @@
       </w:tr>
       <w:tr>
         <w:trPr>
+          <w:cantSplit/>
           <w:tblHeader w:val="false"/>
         </w:trPr>
         <w:tc>
@@ -9670,6 +9789,7 @@
       </w:tr>
       <w:tr>
         <w:trPr>
+          <w:cantSplit/>
           <w:tblHeader w:val="false"/>
         </w:trPr>
         <w:tc>
@@ -9733,6 +9853,7 @@
       </w:tr>
       <w:tr>
         <w:trPr>
+          <w:cantSplit/>
           <w:tblHeader w:val="false"/>
         </w:trPr>
         <w:tc>
@@ -9796,6 +9917,7 @@
       </w:tr>
       <w:tr>
         <w:trPr>
+          <w:cantSplit/>
           <w:tblHeader w:val="false"/>
         </w:trPr>
         <w:tc>
@@ -9859,6 +9981,7 @@
       </w:tr>
       <w:tr>
         <w:trPr>
+          <w:cantSplit/>
           <w:tblHeader w:val="false"/>
         </w:trPr>
         <w:tc>
@@ -9922,6 +10045,7 @@
       </w:tr>
       <w:tr>
         <w:trPr>
+          <w:cantSplit/>
           <w:tblHeader w:val="false"/>
         </w:trPr>
         <w:tc>
@@ -9985,6 +10109,7 @@
       </w:tr>
       <w:tr>
         <w:trPr>
+          <w:cantSplit/>
           <w:tblHeader w:val="false"/>
         </w:trPr>
         <w:tc>
@@ -10048,6 +10173,7 @@
       </w:tr>
       <w:tr>
         <w:trPr>
+          <w:cantSplit/>
           <w:tblHeader w:val="false"/>
         </w:trPr>
         <w:tc>
@@ -10111,6 +10237,7 @@
       </w:tr>
       <w:tr>
         <w:trPr>
+          <w:cantSplit/>
           <w:tblHeader w:val="false"/>
         </w:trPr>
         <w:tc>
@@ -10174,6 +10301,7 @@
       </w:tr>
       <w:tr>
         <w:trPr>
+          <w:cantSplit/>
           <w:tblHeader w:val="false"/>
         </w:trPr>
         <w:tc>
@@ -10237,6 +10365,7 @@
       </w:tr>
       <w:tr>
         <w:trPr>
+          <w:cantSplit/>
           <w:tblHeader w:val="false"/>
         </w:trPr>
         <w:tc>
@@ -10300,6 +10429,7 @@
       </w:tr>
       <w:tr>
         <w:trPr>
+          <w:cantSplit/>
           <w:tblHeader w:val="false"/>
         </w:trPr>
         <w:tc>
@@ -10363,6 +10493,7 @@
       </w:tr>
       <w:tr>
         <w:trPr>
+          <w:cantSplit/>
           <w:tblHeader w:val="false"/>
         </w:trPr>
         <w:tc>
@@ -10426,6 +10557,7 @@
       </w:tr>
       <w:tr>
         <w:trPr>
+          <w:cantSplit/>
           <w:tblHeader w:val="false"/>
         </w:trPr>
         <w:tc>
@@ -10489,6 +10621,7 @@
       </w:tr>
       <w:tr>
         <w:trPr>
+          <w:cantSplit/>
           <w:tblHeader w:val="false"/>
         </w:trPr>
         <w:tc>
@@ -10669,7 +10802,20 @@
           <w:sz w:val="16"/>
           <w:szCs w:val="16"/>
         </w:rPr>
-        <w:t xml:space="preserve">CREATE DATABASE IF NOT EXISTS carbon_logger;</w:t>
+        <w:t xml:space="preserve">-- utf8mb4 lets notes contain symbols such as the rupee sign and Hindi text</w:t>
+      </w:r>
+    </w:p>
+    <w:p>
+      <w:pPr>
+        <w:spacing w:after="0" w:line="228"/>
+      </w:pPr>
+      <w:r>
+        <w:rPr>
+          <w:rFonts w:ascii="Courier New" w:cs="Courier New" w:eastAsia="Courier New" w:hAnsi="Courier New"/>
+          <w:sz w:val="16"/>
+          <w:szCs w:val="16"/>
+        </w:rPr>
+        <w:t xml:space="preserve">CREATE DATABASE IF NOT EXISTS carbon_logger CHARACTER SET utf8mb4;</w:t>
       </w:r>
     </w:p>
     <w:p>
@@ -12203,7 +12349,20 @@
           <w:sz w:val="16"/>
           <w:szCs w:val="16"/>
         </w:rPr>
-        <w:t xml:space="preserve">    cursor.execute("CREATE DATABASE IF NOT EXISTS " + DB_NAME)</w:t>
+        <w:t xml:space="preserve">    # utf8mb4 lets notes contain symbols such as the rupee sign and Hindi text</w:t>
+      </w:r>
+    </w:p>
+    <w:p>
+      <w:pPr>
+        <w:spacing w:after="0" w:line="228"/>
+      </w:pPr>
+      <w:r>
+        <w:rPr>
+          <w:rFonts w:ascii="Courier New" w:cs="Courier New" w:eastAsia="Courier New" w:hAnsi="Courier New"/>
+          <w:sz w:val="16"/>
+          <w:szCs w:val="16"/>
+        </w:rPr>
+        <w:t xml:space="preserve">    cursor.execute("CREATE DATABASE IF NOT EXISTS " + DB_NAME + " CHARACTER SET utf8mb4")</w:t>
       </w:r>
     </w:p>
     <w:p>
@@ -13009,7 +13168,7 @@
           <w:sz w:val="16"/>
           <w:szCs w:val="16"/>
         </w:rPr>
-        <w:t xml:space="preserve">                print("Quantity must be greater than zero.")</w:t>
+        <w:t xml:space="preserve">                print("The value must be greater than zero.")</w:t>
       </w:r>
     </w:p>
     <w:p>
@@ -13100,7 +13259,20 @@
           <w:sz w:val="16"/>
           <w:szCs w:val="16"/>
         </w:rPr>
-        <w:t xml:space="preserve"># Return the date as 'YYYY-MM-DD' if it is valid, otherwise None</w:t>
+        <w:t xml:space="preserve"># Return the date as 'YYYY-MM-DD' if it is valid, otherwise None.</w:t>
+      </w:r>
+    </w:p>
+    <w:p>
+      <w:pPr>
+        <w:spacing w:after="0" w:line="228"/>
+      </w:pPr>
+      <w:r>
+        <w:rPr>
+          <w:rFonts w:ascii="Courier New" w:cs="Courier New" w:eastAsia="Courier New" w:hAnsi="Courier New"/>
+          <w:sz w:val="16"/>
+          <w:szCs w:val="16"/>
+        </w:rPr>
+        <w:t xml:space="preserve"># Only dates from the year 2000 up to today are accepted.</w:t>
       </w:r>
     </w:p>
     <w:p>
@@ -13139,20 +13311,7 @@
           <w:sz w:val="16"/>
           <w:szCs w:val="16"/>
         </w:rPr>
-        <w:t xml:space="preserve">        date_value = datetime.datetime.strptime(date_text, "%Y-%m-%d")</w:t>
-      </w:r>
-    </w:p>
-    <w:p>
-      <w:pPr>
-        <w:spacing w:after="0" w:line="228"/>
-      </w:pPr>
-      <w:r>
-        <w:rPr>
-          <w:rFonts w:ascii="Courier New" w:cs="Courier New" w:eastAsia="Courier New" w:hAnsi="Courier New"/>
-          <w:sz w:val="16"/>
-          <w:szCs w:val="16"/>
-        </w:rPr>
-        <w:t xml:space="preserve">        return date_value.strftime("%Y-%m-%d")</w:t>
+        <w:t xml:space="preserve">        date_value = datetime.datetime.strptime(date_text, "%Y-%m-%d").date()</w:t>
       </w:r>
     </w:p>
     <w:p>
@@ -13191,6 +13350,45 @@
           <w:sz w:val="16"/>
           <w:szCs w:val="16"/>
         </w:rPr>
+        <w:t xml:space="preserve">    if date_value.year &lt; 2000 or date_value &gt; datetime.date.today():</w:t>
+      </w:r>
+    </w:p>
+    <w:p>
+      <w:pPr>
+        <w:spacing w:after="0" w:line="228"/>
+      </w:pPr>
+      <w:r>
+        <w:rPr>
+          <w:rFonts w:ascii="Courier New" w:cs="Courier New" w:eastAsia="Courier New" w:hAnsi="Courier New"/>
+          <w:sz w:val="16"/>
+          <w:szCs w:val="16"/>
+        </w:rPr>
+        <w:t xml:space="preserve">        return None</w:t>
+      </w:r>
+    </w:p>
+    <w:p>
+      <w:pPr>
+        <w:spacing w:after="0" w:line="228"/>
+      </w:pPr>
+      <w:r>
+        <w:rPr>
+          <w:rFonts w:ascii="Courier New" w:cs="Courier New" w:eastAsia="Courier New" w:hAnsi="Courier New"/>
+          <w:sz w:val="16"/>
+          <w:szCs w:val="16"/>
+        </w:rPr>
+        <w:t xml:space="preserve">    return str(date_value)</w:t>
+      </w:r>
+    </w:p>
+    <w:p>
+      <w:pPr>
+        <w:spacing w:after="0" w:line="228"/>
+      </w:pPr>
+      <w:r>
+        <w:rPr>
+          <w:rFonts w:ascii="Courier New" w:cs="Courier New" w:eastAsia="Courier New" w:hAnsi="Courier New"/>
+          <w:sz w:val="16"/>
+          <w:szCs w:val="16"/>
+        </w:rPr>
         <w:t xml:space="preserve"> </w:t>
       </w:r>
     </w:p>
@@ -13321,7 +13519,7 @@
           <w:sz w:val="16"/>
           <w:szCs w:val="16"/>
         </w:rPr>
-        <w:t xml:space="preserve">            print("Invalid date! Example of a correct date: 2026-08-15")</w:t>
+        <w:t xml:space="preserve">            print("Invalid date! Use YYYY-MM-DD, from the year 2000 up to today.")</w:t>
       </w:r>
     </w:p>
     <w:p>
@@ -20237,7 +20435,7 @@
           <w:sz w:val="16"/>
           <w:szCs w:val="16"/>
         </w:rPr>
-        <w:t xml:space="preserve">    print("* Dates are entered as YYYY-MM-DD. Press Enter to use today's date.")</w:t>
+        <w:t xml:space="preserve">    print("* Dates are entered as YYYY-MM-DD, from 2000 up to today. Press Enter for today.")</w:t>
       </w:r>
     </w:p>
     <w:p>
@@ -21095,7 +21293,7 @@
           <w:sz w:val="16"/>
           <w:szCs w:val="16"/>
         </w:rPr>
-        <w:t xml:space="preserve">    except KeyboardInterrupt:</w:t>
+        <w:t xml:space="preserve">    except (KeyboardInterrupt, EOFError):</w:t>
       </w:r>
     </w:p>
     <w:p>
@@ -22305,7 +22503,7 @@
       <w:r>
         <w:drawing>
           <wp:inline distT="0" distB="0" distL="0" distR="0">
-            <wp:extent cx="4695825" cy="5934075"/>
+            <wp:extent cx="4695825" cy="6162675"/>
             <wp:effectExtent t="0" r="0" b="0" l="0"/>
             <wp:docPr id="1" name="15_errors" descr="Error handling: invalid menu choice, category ID, date, quantity and record ID" title="Error handling: invalid menu choice, category ID, date, quantity and record ID"/>
             <wp:cNvGraphicFramePr>
@@ -22330,7 +22528,7 @@
                   <pic:spPr bwMode="auto">
                     <a:xfrm>
                       <a:off x="0" y="0"/>
-                      <a:ext cx="4695825" cy="5934075"/>
+                      <a:ext cx="4695825" cy="6162675"/>
                     </a:xfrm>
                     <a:prstGeom prst="rect">
                       <a:avLst/>
@@ -22402,6 +22600,7 @@
       </w:tblGrid>
       <w:tr>
         <w:trPr>
+          <w:cantSplit/>
           <w:tblHeader/>
         </w:trPr>
         <w:tc>
@@ -22527,6 +22726,7 @@
       </w:tr>
       <w:tr>
         <w:trPr>
+          <w:cantSplit/>
           <w:tblHeader w:val="false"/>
         </w:trPr>
         <w:tc>
@@ -22648,6 +22848,7 @@
       </w:tr>
       <w:tr>
         <w:trPr>
+          <w:cantSplit/>
           <w:tblHeader w:val="false"/>
         </w:trPr>
         <w:tc>
@@ -22769,6 +22970,7 @@
       </w:tr>
       <w:tr>
         <w:trPr>
+          <w:cantSplit/>
           <w:tblHeader w:val="false"/>
         </w:trPr>
         <w:tc>
@@ -22890,6 +23092,7 @@
       </w:tr>
       <w:tr>
         <w:trPr>
+          <w:cantSplit/>
           <w:tblHeader w:val="false"/>
         </w:trPr>
         <w:tc>
@@ -23011,6 +23214,7 @@
       </w:tr>
       <w:tr>
         <w:trPr>
+          <w:cantSplit/>
           <w:tblHeader w:val="false"/>
         </w:trPr>
         <w:tc>
@@ -23125,13 +23329,14 @@
                 <w:sz w:val="21"/>
                 <w:szCs w:val="21"/>
               </w:rPr>
-              <w:t xml:space="preserve">"Quantity must be greater than zero"</w:t>
+              <w:t xml:space="preserve">"The value must be greater than zero"</w:t>
             </w:r>
           </w:p>
         </w:tc>
       </w:tr>
       <w:tr>
         <w:trPr>
+          <w:cantSplit/>
           <w:tblHeader w:val="false"/>
         </w:trPr>
         <w:tc>
@@ -23253,6 +23458,7 @@
       </w:tr>
       <w:tr>
         <w:trPr>
+          <w:cantSplit/>
           <w:tblHeader w:val="false"/>
         </w:trPr>
         <w:tc>
@@ -23374,6 +23580,7 @@
       </w:tr>
       <w:tr>
         <w:trPr>
+          <w:cantSplit/>
           <w:tblHeader w:val="false"/>
         </w:trPr>
         <w:tc>
@@ -23495,6 +23702,7 @@
       </w:tr>
       <w:tr>
         <w:trPr>
+          <w:cantSplit/>
           <w:tblHeader w:val="false"/>
         </w:trPr>
         <w:tc>
@@ -23616,6 +23824,7 @@
       </w:tr>
       <w:tr>
         <w:trPr>
+          <w:cantSplit/>
           <w:tblHeader w:val="false"/>
         </w:trPr>
         <w:tc>
@@ -23737,6 +23946,7 @@
       </w:tr>
       <w:tr>
         <w:trPr>
+          <w:cantSplit/>
           <w:tblHeader w:val="false"/>
         </w:trPr>
         <w:tc>
@@ -23858,6 +24068,7 @@
       </w:tr>
       <w:tr>
         <w:trPr>
+          <w:cantSplit/>
           <w:tblHeader w:val="false"/>
         </w:trPr>
         <w:tc>
@@ -23979,6 +24190,7 @@
       </w:tr>
       <w:tr>
         <w:trPr>
+          <w:cantSplit/>
           <w:tblHeader w:val="false"/>
         </w:trPr>
         <w:tc>
@@ -24100,6 +24312,7 @@
       </w:tr>
       <w:tr>
         <w:trPr>
+          <w:cantSplit/>
           <w:tblHeader w:val="false"/>
         </w:trPr>
         <w:tc>
@@ -24221,6 +24434,7 @@
       </w:tr>
       <w:tr>
         <w:trPr>
+          <w:cantSplit/>
           <w:tblHeader w:val="false"/>
         </w:trPr>
         <w:tc>
@@ -24342,6 +24556,7 @@
       </w:tr>
       <w:tr>
         <w:trPr>
+          <w:cantSplit/>
           <w:tblHeader w:val="false"/>
         </w:trPr>
         <w:tc>
@@ -24463,6 +24678,7 @@
       </w:tr>
       <w:tr>
         <w:trPr>
+          <w:cantSplit/>
           <w:tblHeader w:val="false"/>
         </w:trPr>
         <w:tc>
@@ -24584,6 +24800,7 @@
       </w:tr>
       <w:tr>
         <w:trPr>
+          <w:cantSplit/>
           <w:tblHeader w:val="false"/>
         </w:trPr>
         <w:tc>
@@ -24705,6 +24922,7 @@
       </w:tr>
       <w:tr>
         <w:trPr>
+          <w:cantSplit/>
           <w:tblHeader w:val="false"/>
         </w:trPr>
         <w:tc>
@@ -24826,6 +25044,7 @@
       </w:tr>
       <w:tr>
         <w:trPr>
+          <w:cantSplit/>
           <w:tblHeader w:val="false"/>
         </w:trPr>
         <w:tc>
@@ -24947,6 +25166,7 @@
       </w:tr>
       <w:tr>
         <w:trPr>
+          <w:cantSplit/>
           <w:tblHeader w:val="false"/>
         </w:trPr>
         <w:tc>
@@ -25062,6 +25282,494 @@
                 <w:szCs w:val="21"/>
               </w:rPr>
               <w:t xml:space="preserve">"Nothing to undo"</w:t>
+            </w:r>
+          </w:p>
+        </w:tc>
+      </w:tr>
+      <w:tr>
+        <w:trPr>
+          <w:cantSplit/>
+          <w:tblHeader w:val="false"/>
+        </w:trPr>
+        <w:tc>
+          <w:tcPr>
+            <w:tcW w:type="dxa" w:w="600"/>
+            <w:tcBorders>
+              <w:top w:val="single" w:color="808080" w:sz="4"/>
+              <w:left w:val="single" w:color="808080" w:sz="4"/>
+              <w:bottom w:val="single" w:color="808080" w:sz="4"/>
+              <w:right w:val="single" w:color="808080" w:sz="4"/>
+            </w:tcBorders>
+            <w:tcMar>
+              <w:top w:type="dxa" w:w="60"/>
+              <w:left w:type="dxa" w:w="100"/>
+              <w:bottom w:type="dxa" w:w="60"/>
+              <w:right w:type="dxa" w:w="100"/>
+            </w:tcMar>
+          </w:tcPr>
+          <w:p>
+            <w:r>
+              <w:rPr>
+                <w:rFonts w:ascii="Times New Roman" w:cs="Times New Roman" w:eastAsia="Times New Roman" w:hAnsi="Times New Roman"/>
+                <w:b w:val="false"/>
+                <w:bCs w:val="false"/>
+                <w:sz w:val="21"/>
+                <w:szCs w:val="21"/>
+              </w:rPr>
+              <w:t xml:space="preserve">22</w:t>
+            </w:r>
+          </w:p>
+        </w:tc>
+        <w:tc>
+          <w:tcPr>
+            <w:tcW w:type="dxa" w:w="3000"/>
+            <w:tcBorders>
+              <w:top w:val="single" w:color="808080" w:sz="4"/>
+              <w:left w:val="single" w:color="808080" w:sz="4"/>
+              <w:bottom w:val="single" w:color="808080" w:sz="4"/>
+              <w:right w:val="single" w:color="808080" w:sz="4"/>
+            </w:tcBorders>
+            <w:tcMar>
+              <w:top w:type="dxa" w:w="60"/>
+              <w:left w:type="dxa" w:w="100"/>
+              <w:bottom w:type="dxa" w:w="60"/>
+              <w:right w:type="dxa" w:w="100"/>
+            </w:tcMar>
+          </w:tcPr>
+          <w:p>
+            <w:r>
+              <w:rPr>
+                <w:rFonts w:ascii="Times New Roman" w:cs="Times New Roman" w:eastAsia="Times New Roman" w:hAnsi="Times New Roman"/>
+                <w:b w:val="false"/>
+                <w:bCs w:val="false"/>
+                <w:sz w:val="21"/>
+                <w:szCs w:val="21"/>
+              </w:rPr>
+              <w:t xml:space="preserve">Future date</w:t>
+            </w:r>
+          </w:p>
+        </w:tc>
+        <w:tc>
+          <w:tcPr>
+            <w:tcW w:type="dxa" w:w="3200"/>
+            <w:tcBorders>
+              <w:top w:val="single" w:color="808080" w:sz="4"/>
+              <w:left w:val="single" w:color="808080" w:sz="4"/>
+              <w:bottom w:val="single" w:color="808080" w:sz="4"/>
+              <w:right w:val="single" w:color="808080" w:sz="4"/>
+            </w:tcBorders>
+            <w:tcMar>
+              <w:top w:type="dxa" w:w="60"/>
+              <w:left w:type="dxa" w:w="100"/>
+              <w:bottom w:type="dxa" w:w="60"/>
+              <w:right w:type="dxa" w:w="100"/>
+            </w:tcMar>
+          </w:tcPr>
+          <w:p>
+            <w:r>
+              <w:rPr>
+                <w:rFonts w:ascii="Times New Roman" w:cs="Times New Roman" w:eastAsia="Times New Roman" w:hAnsi="Times New Roman"/>
+                <w:b w:val="false"/>
+                <w:bCs w:val="false"/>
+                <w:sz w:val="21"/>
+                <w:szCs w:val="21"/>
+              </w:rPr>
+              <w:t xml:space="preserve">Tomorrow's date</w:t>
+            </w:r>
+          </w:p>
+        </w:tc>
+        <w:tc>
+          <w:tcPr>
+            <w:tcW w:type="dxa" w:w="2838"/>
+            <w:tcBorders>
+              <w:top w:val="single" w:color="808080" w:sz="4"/>
+              <w:left w:val="single" w:color="808080" w:sz="4"/>
+              <w:bottom w:val="single" w:color="808080" w:sz="4"/>
+              <w:right w:val="single" w:color="808080" w:sz="4"/>
+            </w:tcBorders>
+            <w:tcMar>
+              <w:top w:type="dxa" w:w="60"/>
+              <w:left w:type="dxa" w:w="100"/>
+              <w:bottom w:type="dxa" w:w="60"/>
+              <w:right w:type="dxa" w:w="100"/>
+            </w:tcMar>
+          </w:tcPr>
+          <w:p>
+            <w:r>
+              <w:rPr>
+                <w:rFonts w:ascii="Times New Roman" w:cs="Times New Roman" w:eastAsia="Times New Roman" w:hAnsi="Times New Roman"/>
+                <w:b w:val="false"/>
+                <w:bCs w:val="false"/>
+                <w:sz w:val="21"/>
+                <w:szCs w:val="21"/>
+              </w:rPr>
+              <w:t xml:space="preserve">"Invalid date", asks again</w:t>
+            </w:r>
+          </w:p>
+        </w:tc>
+      </w:tr>
+      <w:tr>
+        <w:trPr>
+          <w:cantSplit/>
+          <w:tblHeader w:val="false"/>
+        </w:trPr>
+        <w:tc>
+          <w:tcPr>
+            <w:tcW w:type="dxa" w:w="600"/>
+            <w:tcBorders>
+              <w:top w:val="single" w:color="808080" w:sz="4"/>
+              <w:left w:val="single" w:color="808080" w:sz="4"/>
+              <w:bottom w:val="single" w:color="808080" w:sz="4"/>
+              <w:right w:val="single" w:color="808080" w:sz="4"/>
+            </w:tcBorders>
+            <w:tcMar>
+              <w:top w:type="dxa" w:w="60"/>
+              <w:left w:type="dxa" w:w="100"/>
+              <w:bottom w:type="dxa" w:w="60"/>
+              <w:right w:type="dxa" w:w="100"/>
+            </w:tcMar>
+          </w:tcPr>
+          <w:p>
+            <w:r>
+              <w:rPr>
+                <w:rFonts w:ascii="Times New Roman" w:cs="Times New Roman" w:eastAsia="Times New Roman" w:hAnsi="Times New Roman"/>
+                <w:b w:val="false"/>
+                <w:bCs w:val="false"/>
+                <w:sz w:val="21"/>
+                <w:szCs w:val="21"/>
+              </w:rPr>
+              <w:t xml:space="preserve">23</w:t>
+            </w:r>
+          </w:p>
+        </w:tc>
+        <w:tc>
+          <w:tcPr>
+            <w:tcW w:type="dxa" w:w="3000"/>
+            <w:tcBorders>
+              <w:top w:val="single" w:color="808080" w:sz="4"/>
+              <w:left w:val="single" w:color="808080" w:sz="4"/>
+              <w:bottom w:val="single" w:color="808080" w:sz="4"/>
+              <w:right w:val="single" w:color="808080" w:sz="4"/>
+            </w:tcBorders>
+            <w:tcMar>
+              <w:top w:type="dxa" w:w="60"/>
+              <w:left w:type="dxa" w:w="100"/>
+              <w:bottom w:type="dxa" w:w="60"/>
+              <w:right w:type="dxa" w:w="100"/>
+            </w:tcMar>
+          </w:tcPr>
+          <w:p>
+            <w:r>
+              <w:rPr>
+                <w:rFonts w:ascii="Times New Roman" w:cs="Times New Roman" w:eastAsia="Times New Roman" w:hAnsi="Times New Roman"/>
+                <w:b w:val="false"/>
+                <w:bCs w:val="false"/>
+                <w:sz w:val="21"/>
+                <w:szCs w:val="21"/>
+              </w:rPr>
+              <w:t xml:space="preserve">Year before 2000 or typing mistake</w:t>
+            </w:r>
+          </w:p>
+        </w:tc>
+        <w:tc>
+          <w:tcPr>
+            <w:tcW w:type="dxa" w:w="3200"/>
+            <w:tcBorders>
+              <w:top w:val="single" w:color="808080" w:sz="4"/>
+              <w:left w:val="single" w:color="808080" w:sz="4"/>
+              <w:bottom w:val="single" w:color="808080" w:sz="4"/>
+              <w:right w:val="single" w:color="808080" w:sz="4"/>
+            </w:tcBorders>
+            <w:tcMar>
+              <w:top w:type="dxa" w:w="60"/>
+              <w:left w:type="dxa" w:w="100"/>
+              <w:bottom w:type="dxa" w:w="60"/>
+              <w:right w:type="dxa" w:w="100"/>
+            </w:tcMar>
+          </w:tcPr>
+          <w:p>
+            <w:r>
+              <w:rPr>
+                <w:rFonts w:ascii="Times New Roman" w:cs="Times New Roman" w:eastAsia="Times New Roman" w:hAnsi="Times New Roman"/>
+                <w:b w:val="false"/>
+                <w:bCs w:val="false"/>
+                <w:sz w:val="21"/>
+                <w:szCs w:val="21"/>
+              </w:rPr>
+              <w:t xml:space="preserve">1999-12-31, 0026-09-15</w:t>
+            </w:r>
+          </w:p>
+        </w:tc>
+        <w:tc>
+          <w:tcPr>
+            <w:tcW w:type="dxa" w:w="2838"/>
+            <w:tcBorders>
+              <w:top w:val="single" w:color="808080" w:sz="4"/>
+              <w:left w:val="single" w:color="808080" w:sz="4"/>
+              <w:bottom w:val="single" w:color="808080" w:sz="4"/>
+              <w:right w:val="single" w:color="808080" w:sz="4"/>
+            </w:tcBorders>
+            <w:tcMar>
+              <w:top w:type="dxa" w:w="60"/>
+              <w:left w:type="dxa" w:w="100"/>
+              <w:bottom w:type="dxa" w:w="60"/>
+              <w:right w:type="dxa" w:w="100"/>
+            </w:tcMar>
+          </w:tcPr>
+          <w:p>
+            <w:r>
+              <w:rPr>
+                <w:rFonts w:ascii="Times New Roman" w:cs="Times New Roman" w:eastAsia="Times New Roman" w:hAnsi="Times New Roman"/>
+                <w:b w:val="false"/>
+                <w:bCs w:val="false"/>
+                <w:sz w:val="21"/>
+                <w:szCs w:val="21"/>
+              </w:rPr>
+              <w:t xml:space="preserve">"Invalid date", asks again</w:t>
+            </w:r>
+          </w:p>
+        </w:tc>
+      </w:tr>
+      <w:tr>
+        <w:trPr>
+          <w:cantSplit/>
+          <w:tblHeader w:val="false"/>
+        </w:trPr>
+        <w:tc>
+          <w:tcPr>
+            <w:tcW w:type="dxa" w:w="600"/>
+            <w:tcBorders>
+              <w:top w:val="single" w:color="808080" w:sz="4"/>
+              <w:left w:val="single" w:color="808080" w:sz="4"/>
+              <w:bottom w:val="single" w:color="808080" w:sz="4"/>
+              <w:right w:val="single" w:color="808080" w:sz="4"/>
+            </w:tcBorders>
+            <w:tcMar>
+              <w:top w:type="dxa" w:w="60"/>
+              <w:left w:type="dxa" w:w="100"/>
+              <w:bottom w:type="dxa" w:w="60"/>
+              <w:right w:type="dxa" w:w="100"/>
+            </w:tcMar>
+          </w:tcPr>
+          <w:p>
+            <w:r>
+              <w:rPr>
+                <w:rFonts w:ascii="Times New Roman" w:cs="Times New Roman" w:eastAsia="Times New Roman" w:hAnsi="Times New Roman"/>
+                <w:b w:val="false"/>
+                <w:bCs w:val="false"/>
+                <w:sz w:val="21"/>
+                <w:szCs w:val="21"/>
+              </w:rPr>
+              <w:t xml:space="preserve">24</w:t>
+            </w:r>
+          </w:p>
+        </w:tc>
+        <w:tc>
+          <w:tcPr>
+            <w:tcW w:type="dxa" w:w="3000"/>
+            <w:tcBorders>
+              <w:top w:val="single" w:color="808080" w:sz="4"/>
+              <w:left w:val="single" w:color="808080" w:sz="4"/>
+              <w:bottom w:val="single" w:color="808080" w:sz="4"/>
+              <w:right w:val="single" w:color="808080" w:sz="4"/>
+            </w:tcBorders>
+            <w:tcMar>
+              <w:top w:type="dxa" w:w="60"/>
+              <w:left w:type="dxa" w:w="100"/>
+              <w:bottom w:type="dxa" w:w="60"/>
+              <w:right w:type="dxa" w:w="100"/>
+            </w:tcMar>
+          </w:tcPr>
+          <w:p>
+            <w:r>
+              <w:rPr>
+                <w:rFonts w:ascii="Times New Roman" w:cs="Times New Roman" w:eastAsia="Times New Roman" w:hAnsi="Times New Roman"/>
+                <w:b w:val="false"/>
+                <w:bCs w:val="false"/>
+                <w:sz w:val="21"/>
+                <w:szCs w:val="21"/>
+              </w:rPr>
+              <w:t xml:space="preserve">End of input at a prompt</w:t>
+            </w:r>
+          </w:p>
+        </w:tc>
+        <w:tc>
+          <w:tcPr>
+            <w:tcW w:type="dxa" w:w="3200"/>
+            <w:tcBorders>
+              <w:top w:val="single" w:color="808080" w:sz="4"/>
+              <w:left w:val="single" w:color="808080" w:sz="4"/>
+              <w:bottom w:val="single" w:color="808080" w:sz="4"/>
+              <w:right w:val="single" w:color="808080" w:sz="4"/>
+            </w:tcBorders>
+            <w:tcMar>
+              <w:top w:type="dxa" w:w="60"/>
+              <w:left w:type="dxa" w:w="100"/>
+              <w:bottom w:type="dxa" w:w="60"/>
+              <w:right w:type="dxa" w:w="100"/>
+            </w:tcMar>
+          </w:tcPr>
+          <w:p>
+            <w:r>
+              <w:rPr>
+                <w:rFonts w:ascii="Times New Roman" w:cs="Times New Roman" w:eastAsia="Times New Roman" w:hAnsi="Times New Roman"/>
+                <w:b w:val="false"/>
+                <w:bCs w:val="false"/>
+                <w:sz w:val="21"/>
+                <w:szCs w:val="21"/>
+              </w:rPr>
+              <w:t xml:space="preserve">Ctrl+D / Ctrl+Z then Enter</w:t>
+            </w:r>
+          </w:p>
+        </w:tc>
+        <w:tc>
+          <w:tcPr>
+            <w:tcW w:type="dxa" w:w="2838"/>
+            <w:tcBorders>
+              <w:top w:val="single" w:color="808080" w:sz="4"/>
+              <w:left w:val="single" w:color="808080" w:sz="4"/>
+              <w:bottom w:val="single" w:color="808080" w:sz="4"/>
+              <w:right w:val="single" w:color="808080" w:sz="4"/>
+            </w:tcBorders>
+            <w:tcMar>
+              <w:top w:type="dxa" w:w="60"/>
+              <w:left w:type="dxa" w:w="100"/>
+              <w:bottom w:type="dxa" w:w="60"/>
+              <w:right w:type="dxa" w:w="100"/>
+            </w:tcMar>
+          </w:tcPr>
+          <w:p>
+            <w:r>
+              <w:rPr>
+                <w:rFonts w:ascii="Times New Roman" w:cs="Times New Roman" w:eastAsia="Times New Roman" w:hAnsi="Times New Roman"/>
+                <w:b w:val="false"/>
+                <w:bCs w:val="false"/>
+                <w:sz w:val="21"/>
+                <w:szCs w:val="21"/>
+              </w:rPr>
+              <w:t xml:space="preserve">"Program stopped by the user", connection closed</w:t>
+            </w:r>
+          </w:p>
+        </w:tc>
+      </w:tr>
+      <w:tr>
+        <w:trPr>
+          <w:cantSplit/>
+          <w:tblHeader w:val="false"/>
+        </w:trPr>
+        <w:tc>
+          <w:tcPr>
+            <w:tcW w:type="dxa" w:w="600"/>
+            <w:tcBorders>
+              <w:top w:val="single" w:color="808080" w:sz="4"/>
+              <w:left w:val="single" w:color="808080" w:sz="4"/>
+              <w:bottom w:val="single" w:color="808080" w:sz="4"/>
+              <w:right w:val="single" w:color="808080" w:sz="4"/>
+            </w:tcBorders>
+            <w:tcMar>
+              <w:top w:type="dxa" w:w="60"/>
+              <w:left w:type="dxa" w:w="100"/>
+              <w:bottom w:type="dxa" w:w="60"/>
+              <w:right w:type="dxa" w:w="100"/>
+            </w:tcMar>
+          </w:tcPr>
+          <w:p>
+            <w:r>
+              <w:rPr>
+                <w:rFonts w:ascii="Times New Roman" w:cs="Times New Roman" w:eastAsia="Times New Roman" w:hAnsi="Times New Roman"/>
+                <w:b w:val="false"/>
+                <w:bCs w:val="false"/>
+                <w:sz w:val="21"/>
+                <w:szCs w:val="21"/>
+              </w:rPr>
+              <w:t xml:space="preserve">25</w:t>
+            </w:r>
+          </w:p>
+        </w:tc>
+        <w:tc>
+          <w:tcPr>
+            <w:tcW w:type="dxa" w:w="3000"/>
+            <w:tcBorders>
+              <w:top w:val="single" w:color="808080" w:sz="4"/>
+              <w:left w:val="single" w:color="808080" w:sz="4"/>
+              <w:bottom w:val="single" w:color="808080" w:sz="4"/>
+              <w:right w:val="single" w:color="808080" w:sz="4"/>
+            </w:tcBorders>
+            <w:tcMar>
+              <w:top w:type="dxa" w:w="60"/>
+              <w:left w:type="dxa" w:w="100"/>
+              <w:bottom w:type="dxa" w:w="60"/>
+              <w:right w:type="dxa" w:w="100"/>
+            </w:tcMar>
+          </w:tcPr>
+          <w:p>
+            <w:r>
+              <w:rPr>
+                <w:rFonts w:ascii="Times New Roman" w:cs="Times New Roman" w:eastAsia="Times New Roman" w:hAnsi="Times New Roman"/>
+                <w:b w:val="false"/>
+                <w:bCs w:val="false"/>
+                <w:sz w:val="21"/>
+                <w:szCs w:val="21"/>
+              </w:rPr>
+              <w:t xml:space="preserve">New database character set</w:t>
+            </w:r>
+          </w:p>
+        </w:tc>
+        <w:tc>
+          <w:tcPr>
+            <w:tcW w:type="dxa" w:w="3200"/>
+            <w:tcBorders>
+              <w:top w:val="single" w:color="808080" w:sz="4"/>
+              <w:left w:val="single" w:color="808080" w:sz="4"/>
+              <w:bottom w:val="single" w:color="808080" w:sz="4"/>
+              <w:right w:val="single" w:color="808080" w:sz="4"/>
+            </w:tcBorders>
+            <w:tcMar>
+              <w:top w:type="dxa" w:w="60"/>
+              <w:left w:type="dxa" w:w="100"/>
+              <w:bottom w:type="dxa" w:w="60"/>
+              <w:right w:type="dxa" w:w="100"/>
+            </w:tcMar>
+          </w:tcPr>
+          <w:p>
+            <w:r>
+              <w:rPr>
+                <w:rFonts w:ascii="Times New Roman" w:cs="Times New Roman" w:eastAsia="Times New Roman" w:hAnsi="Times New Roman"/>
+                <w:b w:val="false"/>
+                <w:bCs w:val="false"/>
+                <w:sz w:val="21"/>
+                <w:szCs w:val="21"/>
+              </w:rPr>
+              <w:t xml:space="preserve">First start</w:t>
+            </w:r>
+          </w:p>
+        </w:tc>
+        <w:tc>
+          <w:tcPr>
+            <w:tcW w:type="dxa" w:w="2838"/>
+            <w:tcBorders>
+              <w:top w:val="single" w:color="808080" w:sz="4"/>
+              <w:left w:val="single" w:color="808080" w:sz="4"/>
+              <w:bottom w:val="single" w:color="808080" w:sz="4"/>
+              <w:right w:val="single" w:color="808080" w:sz="4"/>
+            </w:tcBorders>
+            <w:tcMar>
+              <w:top w:type="dxa" w:w="60"/>
+              <w:left w:type="dxa" w:w="100"/>
+              <w:bottom w:type="dxa" w:w="60"/>
+              <w:right w:type="dxa" w:w="100"/>
+            </w:tcMar>
+          </w:tcPr>
+          <w:p>
+            <w:r>
+              <w:rPr>
+                <w:rFonts w:ascii="Times New Roman" w:cs="Times New Roman" w:eastAsia="Times New Roman" w:hAnsi="Times New Roman"/>
+                <w:b w:val="false"/>
+                <w:bCs w:val="false"/>
+                <w:sz w:val="21"/>
+                <w:szCs w:val="21"/>
+              </w:rPr>
+              <w:t xml:space="preserve">Database created as utf8mb4; ₹/Hindi note saved</w:t>
             </w:r>
           </w:p>
         </w:tc>

</xml_diff>